<commit_message>
Bijlage 3 op de opmaak van bijlage 1 en 2 gezet
De brontabellen hebben geen randen en bijlage 1 en 2 evenmin; mijn versie
gebruikte Table Grid, 10,5 pt en marges van 2,2 cm. Nu randloos, Calibri
9,5 pt, marges 1,8 cm, en de titelregel als gewone alinea van 15 pt vet in
plaats van een blauwe Heading 1. De koppen in het gereproduceerde deel zijn
zwart en vet gemaakt zodat ze bij de andere bijlagen passen maar het
document navigeerbaar blijft.

Tekstcontrole opnieuw gedraaid: alle 12.599 bronwoorden zitten erin.

Meteen ook vastgelegd wat de controle op verwijzingen opleverde: figuur 1,
4 en 5 hebben geen plaatsingsmarkering, en bijlage 4 wordt als enige van de
zeven nergens in de lopende tekst aangehaald.

Co-Authored-By: Claude Opus 5 <noreply@anthropic.com>
</commit_message>
<xml_diff>
--- a/protocol paper/Additional_file_3_Model_informed_consent.docx
+++ b/protocol paper/Additional_file_3_Model_informed_consent.docx
@@ -4,50 +4,79 @@
   <w:body>
     <w:p>
       <w:pPr>
-        <w:pStyle w:val="Heading1"/>
+        <w:spacing w:after="80"/>
       </w:pPr>
       <w:r>
+        <w:rPr>
+          <w:b/>
+          <w:sz w:val="30"/>
+        </w:rPr>
         <w:t>Additional file 3. Model informed consent documentation</w:t>
       </w:r>
     </w:p>
     <w:p>
+      <w:pPr>
+        <w:spacing w:after="200"/>
+      </w:pPr>
       <w:r>
         <w:rPr>
-          <w:i/>
+          <w:b w:val="0"/>
+          <w:sz w:val="19"/>
         </w:rPr>
         <w:t>Integrating offloading, adherence monitoring and behaviour change to prevent diabetic foot ulcer recurrence: protocol for the PARADISE multicentre randomised controlled trial</w:t>
       </w:r>
     </w:p>
     <w:p>
-      <w:r>
+      <w:pPr>
+        <w:spacing w:after="120"/>
+      </w:pPr>
+      <w:r>
+        <w:rPr>
+          <w:b w:val="0"/>
+          <w:sz w:val="18"/>
+        </w:rPr>
         <w:t>This file reproduces the model information and informed consent documentation submitted to the Ethics Committee of University Hospitals Leuven for the PARADISE trial (study reference S71769, protocol version 1.0 of 17 May 2026). Three separate documents are used, one for each group from whom written consent is obtained before any study-specific procedure: trial participants, the professionals delivering the intervention, and the management of the participating diabetic foot clinics.</w:t>
       </w:r>
     </w:p>
     <w:p>
-      <w:r>
+      <w:pPr>
+        <w:spacing w:after="120"/>
+      </w:pPr>
+      <w:r>
+        <w:rPr>
+          <w:b w:val="0"/>
+          <w:sz w:val="18"/>
+        </w:rPr>
         <w:t>The documents are reproduced in Dutch, the language in which consent is obtained. Eligibility is restricted to participants able to comprehend Dutch, because the education and behavioural components of the intervention are delivered conversationally; this restriction and its equity implications are discussed in the manuscript. Site-specific contact details and local ethics committee references are completed per centre before use.</w:t>
       </w:r>
     </w:p>
     <w:p>
-      <w:r>
+      <w:pPr>
+        <w:spacing w:after="240"/>
+      </w:pPr>
+      <w:r>
+        <w:rPr>
+          <w:b w:val="0"/>
+          <w:sz w:val="17"/>
+        </w:rPr>
         <w:t>Text, headings, tables and figures are reproduced as submitted. Editorial comments and tracked changes present in the working files have been removed, and list numbering has been re-applied, so that the three documents can be read as one file.</w:t>
       </w:r>
     </w:p>
     <w:tbl>
       <w:tblPr>
-        <w:tblStyle w:val="TableGrid"/>
         <w:tblW w:type="auto" w:w="0"/>
+        <w:jc w:val="left"/>
         <w:tblLook w:firstColumn="1" w:firstRow="1" w:lastColumn="0" w:lastRow="0" w:noHBand="0" w:noVBand="1" w:val="04A0"/>
       </w:tblPr>
       <w:tblGrid>
-        <w:gridCol w:w="3249"/>
-        <w:gridCol w:w="3249"/>
-        <w:gridCol w:w="3249"/>
+        <w:gridCol w:w="3400"/>
+        <w:gridCol w:w="3400"/>
+        <w:gridCol w:w="3400"/>
       </w:tblGrid>
       <w:tr>
         <w:tc>
           <w:tcPr>
-            <w:tcW w:type="dxa" w:w="3249"/>
+            <w:tcW w:type="dxa" w:w="4082"/>
           </w:tcPr>
           <w:p>
             <w:r/>
@@ -61,7 +90,7 @@
         </w:tc>
         <w:tc>
           <w:tcPr>
-            <w:tcW w:type="dxa" w:w="3249"/>
+            <w:tcW w:type="dxa" w:w="3628"/>
           </w:tcPr>
           <w:p>
             <w:r/>
@@ -75,7 +104,7 @@
         </w:tc>
         <w:tc>
           <w:tcPr>
-            <w:tcW w:type="dxa" w:w="3249"/>
+            <w:tcW w:type="dxa" w:w="2494"/>
           </w:tcPr>
           <w:p>
             <w:r/>
@@ -91,7 +120,7 @@
       <w:tr>
         <w:tc>
           <w:tcPr>
-            <w:tcW w:type="dxa" w:w="3249"/>
+            <w:tcW w:type="dxa" w:w="4082"/>
           </w:tcPr>
           <w:p>
             <w:r>
@@ -101,7 +130,7 @@
         </w:tc>
         <w:tc>
           <w:tcPr>
-            <w:tcW w:type="dxa" w:w="3249"/>
+            <w:tcW w:type="dxa" w:w="3628"/>
           </w:tcPr>
           <w:p>
             <w:r>
@@ -111,7 +140,7 @@
         </w:tc>
         <w:tc>
           <w:tcPr>
-            <w:tcW w:type="dxa" w:w="3249"/>
+            <w:tcW w:type="dxa" w:w="2494"/>
           </w:tcPr>
           <w:p>
             <w:r>
@@ -123,7 +152,7 @@
       <w:tr>
         <w:tc>
           <w:tcPr>
-            <w:tcW w:type="dxa" w:w="3249"/>
+            <w:tcW w:type="dxa" w:w="4082"/>
           </w:tcPr>
           <w:p>
             <w:r>
@@ -133,7 +162,7 @@
         </w:tc>
         <w:tc>
           <w:tcPr>
-            <w:tcW w:type="dxa" w:w="3249"/>
+            <w:tcW w:type="dxa" w:w="3628"/>
           </w:tcPr>
           <w:p>
             <w:r>
@@ -143,7 +172,7 @@
         </w:tc>
         <w:tc>
           <w:tcPr>
-            <w:tcW w:type="dxa" w:w="3249"/>
+            <w:tcW w:type="dxa" w:w="2494"/>
           </w:tcPr>
           <w:p>
             <w:r>
@@ -155,7 +184,7 @@
       <w:tr>
         <w:tc>
           <w:tcPr>
-            <w:tcW w:type="dxa" w:w="3249"/>
+            <w:tcW w:type="dxa" w:w="4082"/>
           </w:tcPr>
           <w:p>
             <w:r>
@@ -165,7 +194,7 @@
         </w:tc>
         <w:tc>
           <w:tcPr>
-            <w:tcW w:type="dxa" w:w="3249"/>
+            <w:tcW w:type="dxa" w:w="3628"/>
           </w:tcPr>
           <w:p>
             <w:r>
@@ -175,7 +204,7 @@
         </w:tc>
         <w:tc>
           <w:tcPr>
-            <w:tcW w:type="dxa" w:w="3249"/>
+            <w:tcW w:type="dxa" w:w="2494"/>
           </w:tcPr>
           <w:p>
             <w:r>
@@ -200,14 +229,17 @@
       </w:r>
     </w:p>
     <w:p>
+      <w:pPr>
+        <w:spacing w:after="200"/>
+      </w:pPr>
       <w:r>
         <w:rPr>
           <w:i/>
+          <w:sz w:val="17"/>
         </w:rPr>
         <w:t>Source: S71769_(e)CRF_Document 02_PATIENT-ICF-Informatieformulier-Kostenformulier_V1.docx — version 1, 9 July 2026. Language: Dutch.</w:t>
       </w:r>
     </w:p>
-    <w:p/>
     <w:p>
       <w:pPr/>
       <w:r>
@@ -882,18 +914,17 @@
     </w:p>
     <w:tbl>
       <w:tblPr>
-        <w:tblStyle w:val="TableGrid"/>
         <w:tblW w:type="auto" w:w="0"/>
         <w:jc w:val="left"/>
         <w:tblLook w:firstColumn="1" w:firstRow="1" w:lastColumn="0" w:lastRow="0" w:noHBand="0" w:noVBand="1" w:val="04A0"/>
       </w:tblPr>
       <w:tblGrid>
-        <w:gridCol w:w="9746"/>
+        <w:gridCol w:w="10200"/>
       </w:tblGrid>
       <w:tr>
         <w:tc>
           <w:tcPr>
-            <w:tcW w:type="dxa" w:w="9746"/>
+            <w:tcW w:type="dxa" w:w="10200"/>
           </w:tcPr>
           <w:p>
             <w:r/>
@@ -2124,7 +2155,7 @@
       <w:r>
         <w:drawing>
           <wp:inline xmlns:a="http://schemas.openxmlformats.org/drawingml/2006/main" xmlns:pic="http://schemas.openxmlformats.org/drawingml/2006/picture">
-            <wp:extent cx="4320000" cy="3129543"/>
+            <wp:extent cx="3960000" cy="2868748"/>
             <wp:docPr id="1" name="Picture 1"/>
             <wp:cNvGraphicFramePr>
               <a:graphicFrameLocks noChangeAspect="1"/>
@@ -2145,7 +2176,7 @@
                   <pic:spPr>
                     <a:xfrm>
                       <a:off x="0" y="0"/>
-                      <a:ext cx="4320000" cy="3129543"/>
+                      <a:ext cx="3960000" cy="2868748"/>
                     </a:xfrm>
                     <a:prstGeom prst="rect"/>
                   </pic:spPr>
@@ -2158,7 +2189,7 @@
       <w:r>
         <w:drawing>
           <wp:inline xmlns:a="http://schemas.openxmlformats.org/drawingml/2006/main" xmlns:pic="http://schemas.openxmlformats.org/drawingml/2006/picture">
-            <wp:extent cx="4320000" cy="2874764"/>
+            <wp:extent cx="3960000" cy="2635200"/>
             <wp:docPr id="2" name="Picture 2"/>
             <wp:cNvGraphicFramePr>
               <a:graphicFrameLocks noChangeAspect="1"/>
@@ -2179,7 +2210,7 @@
                   <pic:spPr>
                     <a:xfrm>
                       <a:off x="0" y="0"/>
-                      <a:ext cx="4320000" cy="2874764"/>
+                      <a:ext cx="3960000" cy="2635200"/>
                     </a:xfrm>
                     <a:prstGeom prst="rect"/>
                   </pic:spPr>
@@ -2192,7 +2223,7 @@
       <w:r>
         <w:drawing>
           <wp:inline xmlns:a="http://schemas.openxmlformats.org/drawingml/2006/main" xmlns:pic="http://schemas.openxmlformats.org/drawingml/2006/picture">
-            <wp:extent cx="4320000" cy="2181217"/>
+            <wp:extent cx="3960000" cy="1999449"/>
             <wp:docPr id="3" name="Picture 3"/>
             <wp:cNvGraphicFramePr>
               <a:graphicFrameLocks noChangeAspect="1"/>
@@ -2213,7 +2244,7 @@
                   <pic:spPr>
                     <a:xfrm>
                       <a:off x="0" y="0"/>
-                      <a:ext cx="4320000" cy="2181217"/>
+                      <a:ext cx="3960000" cy="1999449"/>
                     </a:xfrm>
                     <a:prstGeom prst="rect"/>
                   </pic:spPr>
@@ -2304,7 +2335,7 @@
       <w:r>
         <w:drawing>
           <wp:inline xmlns:a="http://schemas.openxmlformats.org/drawingml/2006/main" xmlns:pic="http://schemas.openxmlformats.org/drawingml/2006/picture">
-            <wp:extent cx="4320000" cy="2874764"/>
+            <wp:extent cx="3960000" cy="2635200"/>
             <wp:docPr id="4" name="Picture 4"/>
             <wp:cNvGraphicFramePr>
               <a:graphicFrameLocks noChangeAspect="1"/>
@@ -2325,7 +2356,7 @@
                   <pic:spPr>
                     <a:xfrm>
                       <a:off x="0" y="0"/>
-                      <a:ext cx="4320000" cy="2874764"/>
+                      <a:ext cx="3960000" cy="2635200"/>
                     </a:xfrm>
                     <a:prstGeom prst="rect"/>
                   </pic:spPr>
@@ -3499,7 +3530,7 @@
       <w:r>
         <w:drawing>
           <wp:inline xmlns:a="http://schemas.openxmlformats.org/drawingml/2006/main" xmlns:pic="http://schemas.openxmlformats.org/drawingml/2006/picture">
-            <wp:extent cx="4320000" cy="3536202"/>
+            <wp:extent cx="3960000" cy="3241519"/>
             <wp:docPr id="5" name="Picture 5"/>
             <wp:cNvGraphicFramePr>
               <a:graphicFrameLocks noChangeAspect="1"/>
@@ -3520,7 +3551,7 @@
                   <pic:spPr>
                     <a:xfrm>
                       <a:off x="0" y="0"/>
-                      <a:ext cx="4320000" cy="3536202"/>
+                      <a:ext cx="3960000" cy="3241519"/>
                     </a:xfrm>
                     <a:prstGeom prst="rect"/>
                   </pic:spPr>
@@ -5374,14 +5405,17 @@
       </w:r>
     </w:p>
     <w:p>
+      <w:pPr>
+        <w:spacing w:after="200"/>
+      </w:pPr>
       <w:r>
         <w:rPr>
           <w:i/>
+          <w:sz w:val="17"/>
         </w:rPr>
         <w:t>Source: S71769_(e)CRF_Document 04_THERAPIST_ICF_V1.docx — version 1, 9 July 2026. Language: Dutch.</w:t>
       </w:r>
     </w:p>
-    <w:p/>
     <w:p>
       <w:pPr/>
       <w:r>
@@ -6482,18 +6516,17 @@
     </w:p>
     <w:tbl>
       <w:tblPr>
-        <w:tblStyle w:val="TableGrid"/>
         <w:tblW w:type="auto" w:w="0"/>
         <w:jc w:val="left"/>
         <w:tblLook w:firstColumn="1" w:firstRow="1" w:lastColumn="0" w:lastRow="0" w:noHBand="0" w:noVBand="1" w:val="04A0"/>
       </w:tblPr>
       <w:tblGrid>
-        <w:gridCol w:w="9746"/>
+        <w:gridCol w:w="10200"/>
       </w:tblGrid>
       <w:tr>
         <w:tc>
           <w:tcPr>
-            <w:tcW w:type="dxa" w:w="9746"/>
+            <w:tcW w:type="dxa" w:w="10200"/>
           </w:tcPr>
           <w:p>
             <w:r/>
@@ -9392,19 +9425,18 @@
     </w:p>
     <w:tbl>
       <w:tblPr>
-        <w:tblStyle w:val="TableGrid"/>
         <w:tblW w:type="auto" w:w="0"/>
         <w:jc w:val="left"/>
         <w:tblLook w:firstColumn="1" w:firstRow="1" w:lastColumn="0" w:lastRow="0" w:noHBand="0" w:noVBand="1" w:val="04A0"/>
       </w:tblPr>
       <w:tblGrid>
-        <w:gridCol w:w="4873"/>
-        <w:gridCol w:w="4873"/>
+        <w:gridCol w:w="5100"/>
+        <w:gridCol w:w="5100"/>
       </w:tblGrid>
       <w:tr>
         <w:tc>
           <w:tcPr>
-            <w:tcW w:type="dxa" w:w="4873"/>
+            <w:tcW w:type="dxa" w:w="5100"/>
           </w:tcPr>
           <w:p>
             <w:r/>
@@ -9415,7 +9447,7 @@
         </w:tc>
         <w:tc>
           <w:tcPr>
-            <w:tcW w:type="dxa" w:w="4873"/>
+            <w:tcW w:type="dxa" w:w="5100"/>
           </w:tcPr>
           <w:p>
             <w:r/>
@@ -9894,19 +9926,18 @@
     </w:p>
     <w:tbl>
       <w:tblPr>
-        <w:tblStyle w:val="TableGrid"/>
         <w:tblW w:type="auto" w:w="0"/>
         <w:jc w:val="left"/>
         <w:tblLook w:firstColumn="1" w:firstRow="1" w:lastColumn="0" w:lastRow="0" w:noHBand="0" w:noVBand="1" w:val="04A0"/>
       </w:tblPr>
       <w:tblGrid>
-        <w:gridCol w:w="4873"/>
-        <w:gridCol w:w="4873"/>
+        <w:gridCol w:w="5100"/>
+        <w:gridCol w:w="5100"/>
       </w:tblGrid>
       <w:tr>
         <w:tc>
           <w:tcPr>
-            <w:tcW w:type="dxa" w:w="4873"/>
+            <w:tcW w:type="dxa" w:w="5100"/>
           </w:tcPr>
           <w:p>
             <w:r/>
@@ -9917,7 +9948,7 @@
         </w:tc>
         <w:tc>
           <w:tcPr>
-            <w:tcW w:type="dxa" w:w="4873"/>
+            <w:tcW w:type="dxa" w:w="5100"/>
           </w:tcPr>
           <w:p>
             <w:r/>
@@ -10767,14 +10798,17 @@
       </w:r>
     </w:p>
     <w:p>
+      <w:pPr>
+        <w:spacing w:after="200"/>
+      </w:pPr>
       <w:r>
         <w:rPr>
           <w:i/>
+          <w:sz w:val="17"/>
         </w:rPr>
         <w:t>Source: S71769_(e)CRF_Document 05_Informatie-en toestemmingsformulier_MANAGER_PARADISE_V1.docx — version 1, 9 July 2026. Language: Dutch.</w:t>
       </w:r>
     </w:p>
-    <w:p/>
     <w:p>
       <w:pPr/>
       <w:r>
@@ -11875,18 +11909,17 @@
     </w:p>
     <w:tbl>
       <w:tblPr>
-        <w:tblStyle w:val="TableGrid"/>
         <w:tblW w:type="auto" w:w="0"/>
         <w:jc w:val="left"/>
         <w:tblLook w:firstColumn="1" w:firstRow="1" w:lastColumn="0" w:lastRow="0" w:noHBand="0" w:noVBand="1" w:val="04A0"/>
       </w:tblPr>
       <w:tblGrid>
-        <w:gridCol w:w="9746"/>
+        <w:gridCol w:w="10200"/>
       </w:tblGrid>
       <w:tr>
         <w:tc>
           <w:tcPr>
-            <w:tcW w:type="dxa" w:w="9746"/>
+            <w:tcW w:type="dxa" w:w="10200"/>
           </w:tcPr>
           <w:p>
             <w:r/>
@@ -14508,19 +14541,18 @@
     </w:p>
     <w:tbl>
       <w:tblPr>
-        <w:tblStyle w:val="TableGrid"/>
         <w:tblW w:type="auto" w:w="0"/>
         <w:jc w:val="left"/>
         <w:tblLook w:firstColumn="1" w:firstRow="1" w:lastColumn="0" w:lastRow="0" w:noHBand="0" w:noVBand="1" w:val="04A0"/>
       </w:tblPr>
       <w:tblGrid>
-        <w:gridCol w:w="4873"/>
-        <w:gridCol w:w="4873"/>
+        <w:gridCol w:w="5100"/>
+        <w:gridCol w:w="5100"/>
       </w:tblGrid>
       <w:tr>
         <w:tc>
           <w:tcPr>
-            <w:tcW w:type="dxa" w:w="4873"/>
+            <w:tcW w:type="dxa" w:w="5100"/>
           </w:tcPr>
           <w:p>
             <w:r/>
@@ -14531,7 +14563,7 @@
         </w:tc>
         <w:tc>
           <w:tcPr>
-            <w:tcW w:type="dxa" w:w="4873"/>
+            <w:tcW w:type="dxa" w:w="5100"/>
           </w:tcPr>
           <w:p>
             <w:r/>
@@ -14980,19 +15012,18 @@
     </w:p>
     <w:tbl>
       <w:tblPr>
-        <w:tblStyle w:val="TableGrid"/>
         <w:tblW w:type="auto" w:w="0"/>
         <w:jc w:val="left"/>
         <w:tblLook w:firstColumn="1" w:firstRow="1" w:lastColumn="0" w:lastRow="0" w:noHBand="0" w:noVBand="1" w:val="04A0"/>
       </w:tblPr>
       <w:tblGrid>
-        <w:gridCol w:w="4873"/>
-        <w:gridCol w:w="4873"/>
+        <w:gridCol w:w="5100"/>
+        <w:gridCol w:w="5100"/>
       </w:tblGrid>
       <w:tr>
         <w:tc>
           <w:tcPr>
-            <w:tcW w:type="dxa" w:w="4873"/>
+            <w:tcW w:type="dxa" w:w="5100"/>
           </w:tcPr>
           <w:p>
             <w:r/>
@@ -15003,7 +15034,7 @@
         </w:tc>
         <w:tc>
           <w:tcPr>
-            <w:tcW w:type="dxa" w:w="4873"/>
+            <w:tcW w:type="dxa" w:w="5100"/>
           </w:tcPr>
           <w:p>
             <w:r/>
@@ -15854,7 +15885,7 @@
     </w:p>
     <w:sectPr>
       <w:pgSz w:w="12240" w:h="15840"/>
-      <w:pgMar w:top="1440" w:right="1247" w:bottom="1440" w:left="1247" w:header="720" w:footer="720" w:gutter="0"/>
+      <w:pgMar w:top="1440" w:right="1020" w:bottom="1440" w:left="1020" w:header="720" w:footer="720" w:gutter="0"/>
       <w:cols w:space="720"/>
       <w:docGrid w:linePitch="360"/>
     </w:sectPr>
@@ -16227,7 +16258,7 @@
     <w:rsid w:val="00FC693F"/>
     <w:rPr>
       <w:rFonts w:ascii="Calibri" w:hAnsi="Calibri"/>
-      <w:sz w:val="21"/>
+      <w:sz w:val="19"/>
     </w:rPr>
   </w:style>
   <w:style w:type="paragraph" w:styleId="Header">
@@ -16285,15 +16316,15 @@
     <w:pPr>
       <w:keepNext/>
       <w:keepLines/>
-      <w:spacing w:before="480" w:after="0"/>
+      <w:spacing w:before="200" w:after="60"/>
       <w:outlineLvl w:val="0"/>
     </w:pPr>
     <w:rPr>
-      <w:rFonts w:asciiTheme="majorHAnsi" w:eastAsiaTheme="majorEastAsia" w:hAnsiTheme="majorHAnsi" w:cstheme="majorBidi"/>
+      <w:rFonts w:asciiTheme="majorHAnsi" w:eastAsiaTheme="majorEastAsia" w:hAnsiTheme="majorHAnsi" w:cstheme="majorBidi" w:ascii="Calibri" w:hAnsi="Calibri"/>
       <w:b/>
       <w:bCs/>
-      <w:color w:val="365F91" w:themeColor="accent1" w:themeShade="BF"/>
-      <w:sz w:val="28"/>
+      <w:color w:val="000000"/>
+      <w:sz w:val="24"/>
       <w:szCs w:val="28"/>
     </w:rPr>
   </w:style>
@@ -16309,15 +16340,15 @@
     <w:pPr>
       <w:keepNext/>
       <w:keepLines/>
-      <w:spacing w:before="200" w:after="0"/>
+      <w:spacing w:before="200" w:after="60"/>
       <w:outlineLvl w:val="1"/>
     </w:pPr>
     <w:rPr>
-      <w:rFonts w:asciiTheme="majorHAnsi" w:eastAsiaTheme="majorEastAsia" w:hAnsiTheme="majorHAnsi" w:cstheme="majorBidi"/>
+      <w:rFonts w:asciiTheme="majorHAnsi" w:eastAsiaTheme="majorEastAsia" w:hAnsiTheme="majorHAnsi" w:cstheme="majorBidi" w:ascii="Calibri" w:hAnsi="Calibri"/>
       <w:b/>
       <w:bCs/>
-      <w:color w:val="4F81BD" w:themeColor="accent1"/>
-      <w:sz w:val="26"/>
+      <w:color w:val="000000"/>
+      <w:sz w:val="22"/>
       <w:szCs w:val="26"/>
     </w:rPr>
   </w:style>
@@ -16333,14 +16364,15 @@
     <w:pPr>
       <w:keepNext/>
       <w:keepLines/>
-      <w:spacing w:before="200" w:after="0"/>
+      <w:spacing w:before="200" w:after="60"/>
       <w:outlineLvl w:val="2"/>
     </w:pPr>
     <w:rPr>
-      <w:rFonts w:asciiTheme="majorHAnsi" w:eastAsiaTheme="majorEastAsia" w:hAnsiTheme="majorHAnsi" w:cstheme="majorBidi"/>
+      <w:rFonts w:asciiTheme="majorHAnsi" w:eastAsiaTheme="majorEastAsia" w:hAnsiTheme="majorHAnsi" w:cstheme="majorBidi" w:ascii="Calibri" w:hAnsi="Calibri"/>
       <w:b/>
       <w:bCs/>
-      <w:color w:val="4F81BD" w:themeColor="accent1"/>
+      <w:color w:val="000000"/>
+      <w:sz w:val="20"/>
     </w:rPr>
   </w:style>
   <w:style w:type="paragraph" w:styleId="Heading4">

</xml_diff>

<commit_message>
Witregels bovenaan pagina's uit bijlage 3 gehaald
De brondocumenten gebruiken lege alinea's als verticale ruimte -- 211 in
totaal, met reeksen tot negen achter elkaar. Bij herpaginering belandden
die willekeurig bovenaan een pagina, met een witregel voor de eerste
tekst als gevolg.

Ze zijn nu omgezet in ruimte na de vorige alinea, gestapeld tot maximaal
24 pt. Dat kan niet bovenaan een pagina terechtkomen. Verder: de
paginascheiding tussen de drie documenten zit op de kop zelf in plaats
van in een losse lege alinea, koppen krijgen keep_with_next zodat ze niet
alleen onderaan blijven staan, en de lege alinea na elke tabel is weg.

Met Word gerenderd en nagekeken: van 42 naar 33 pagina's, en van zes
pagina's die met een witregel begonnen naar geen enkele. De twee pagina's
die niet met tekst beginnen, beginnen met een figuur. Woordcontrole
opnieuw gedraaid: alle 12.599 bronwoorden zitten er nog in.

Co-Authored-By: Claude Opus 5 <noreply@anthropic.com>
</commit_message>
<xml_diff>
--- a/protocol paper/Additional_file_3_Model_informed_consent.docx
+++ b/protocol paper/Additional_file_3_Model_informed_consent.docx
@@ -214,15 +214,10 @@
         </w:tc>
       </w:tr>
     </w:tbl>
-    <w:p/>
-    <w:p>
-      <w:r>
-        <w:br w:type="page"/>
-      </w:r>
-    </w:p>
     <w:p>
       <w:pPr>
         <w:pStyle w:val="Heading1"/>
+        <w:pageBreakBefore/>
       </w:pPr>
       <w:r>
         <w:t>Participant information and informed consent form, including the statement of costs</w:t>
@@ -663,7 +658,9 @@
       </w:hyperlink>
     </w:p>
     <w:p>
-      <w:pPr/>
+      <w:pPr>
+        <w:spacing w:after="240"/>
+      </w:pPr>
       <w:r>
         <w:t>Dr. Gertjan Vereecke, AZ G</w:t>
       </w:r>
@@ -681,9 +678,6 @@
       </w:hyperlink>
     </w:p>
     <w:p>
-      <w:pPr/>
-    </w:p>
-    <w:p>
       <w:pPr>
         <w:pStyle w:val="Heading2"/>
       </w:pPr>
@@ -712,7 +706,9 @@
       </w:r>
     </w:p>
     <w:p>
-      <w:pPr/>
+      <w:pPr>
+        <w:spacing w:after="240"/>
+      </w:pPr>
       <w:r>
         <w:t xml:space="preserve">Deze studie wordt georganiseerd door de KU Leuven en uitgevoerd in samenwerking met meerdere </w:t>
       </w:r>
@@ -724,10 +720,9 @@
       </w:r>
     </w:p>
     <w:p>
-      <w:pPr/>
-    </w:p>
-    <w:p>
-      <w:pPr/>
+      <w:pPr>
+        <w:spacing w:after="240"/>
+      </w:pPr>
       <w:r>
         <w:t xml:space="preserve">Dit document bestaat uit </w:t>
       </w:r>
@@ -740,9 +735,6 @@
       <w:r>
         <w:t>:</w:t>
       </w:r>
-    </w:p>
-    <w:p>
-      <w:pPr/>
     </w:p>
     <w:p>
       <w:pPr>
@@ -763,13 +755,11 @@
     <w:p>
       <w:pPr>
         <w:pStyle w:val="ListNumber"/>
+        <w:spacing w:after="240"/>
       </w:pPr>
       <w:r>
         <w:t>Een kostenformulier</w:t>
       </w:r>
-    </w:p>
-    <w:p>
-      <w:pPr/>
     </w:p>
     <w:p>
       <w:pPr/>
@@ -865,6 +855,7 @@
     <w:p>
       <w:pPr>
         <w:pStyle w:val="ListBullet"/>
+        <w:spacing w:after="240"/>
       </w:pPr>
       <w:r>
         <w:t>Indien u extra informatie wenst, u altijd contact kunt opnemen met de onderzoeker of een medewerker van zijn team.</w:t>
@@ -874,43 +865,30 @@
       </w:r>
     </w:p>
     <w:p>
+      <w:pPr>
+        <w:spacing w:after="240"/>
+      </w:pPr>
+      <w:r>
+        <w:t xml:space="preserve">Alvast bedankt voor uw </w:t>
+      </w:r>
+      <w:r>
+        <w:t xml:space="preserve">tijd en </w:t>
+      </w:r>
+      <w:r>
+        <w:t>interesse.</w:t>
+      </w:r>
+      <w:r>
+        <w:t xml:space="preserve"> </w:t>
+      </w:r>
+    </w:p>
+    <w:p>
       <w:pPr/>
       <w:r>
+        <w:t>Hoogachtend,</w:t>
+      </w:r>
+      <w:r>
         <w:t xml:space="preserve"> </w:t>
       </w:r>
-    </w:p>
-    <w:p>
-      <w:pPr/>
-      <w:r>
-        <w:t xml:space="preserve">Alvast bedankt voor uw </w:t>
-      </w:r>
-      <w:r>
-        <w:t xml:space="preserve">tijd en </w:t>
-      </w:r>
-      <w:r>
-        <w:t>interesse.</w:t>
-      </w:r>
-      <w:r>
-        <w:t xml:space="preserve"> </w:t>
-      </w:r>
-    </w:p>
-    <w:p>
-      <w:pPr/>
-      <w:r>
-        <w:t xml:space="preserve"> </w:t>
-      </w:r>
-    </w:p>
-    <w:p>
-      <w:pPr/>
-      <w:r>
-        <w:t>Hoogachtend,</w:t>
-      </w:r>
-      <w:r>
-        <w:t xml:space="preserve"> </w:t>
-      </w:r>
-    </w:p>
-    <w:p>
-      <w:pPr/>
     </w:p>
     <w:tbl>
       <w:tblPr>
@@ -945,16 +923,6 @@
         </w:tc>
       </w:tr>
     </w:tbl>
-    <w:p/>
-    <w:p>
-      <w:pPr/>
-    </w:p>
-    <w:p>
-      <w:pPr/>
-    </w:p>
-    <w:p>
-      <w:pPr/>
-    </w:p>
     <w:p>
       <w:pPr>
         <w:pStyle w:val="Heading3"/>
@@ -1572,7 +1540,9 @@
       </w:r>
     </w:p>
     <w:p>
-      <w:pPr/>
+      <w:pPr>
+        <w:spacing w:after="240"/>
+      </w:pPr>
       <w:r>
         <w:t xml:space="preserve">Indien u beslist om deel te nemen, zal u gedurende een periode van achttien maanden worden opgevolgd in de diabetesvoetkliniek waar u behandeld wordt. De studie verloopt volgens een </w:t>
       </w:r>
@@ -1596,10 +1566,9 @@
       </w:r>
     </w:p>
     <w:p>
-      <w:pPr/>
-    </w:p>
-    <w:p>
-      <w:pPr/>
+      <w:pPr>
+        <w:spacing w:after="240"/>
+      </w:pPr>
       <w:r>
         <w:t xml:space="preserve">Na uw </w:t>
       </w:r>
@@ -1639,9 +1608,6 @@
     </w:p>
     <w:p>
       <w:pPr/>
-    </w:p>
-    <w:p>
-      <w:pPr/>
       <w:r>
         <w:t xml:space="preserve">Tijdens de studie zal u op </w:t>
       </w:r>
@@ -1732,7 +1698,9 @@
       </w:r>
     </w:p>
     <w:p>
-      <w:pPr/>
+      <w:pPr>
+        <w:spacing w:after="240"/>
+      </w:pPr>
       <w:r>
         <w:t>Van u wordt verwacht dat u de geplande afspraken bijwoont en de instructies van de onderzoekers opvolgt. Het is belangrijk dat u het voorgeschreven schoeisel zo goed mogelijk draagt en eventuele problemen, zoals pijn, wondjes of andere klachten, tijdig meldt aan de therapeuten</w:t>
       </w:r>
@@ -1741,12 +1709,6 @@
       </w:r>
       <w:r>
         <w:t xml:space="preserve"> Uw actieve medewerking is essentieel voor het goede verloop van de studie.</w:t>
-      </w:r>
-    </w:p>
-    <w:p>
-      <w:pPr/>
-      <w:r>
-        <w:br/>
       </w:r>
     </w:p>
     <w:p>
@@ -2151,7 +2113,9 @@
       </w:r>
     </w:p>
     <w:p>
-      <w:pPr/>
+      <w:pPr>
+        <w:spacing w:after="480"/>
+      </w:pPr>
       <w:r>
         <w:drawing>
           <wp:inline xmlns:a="http://schemas.openxmlformats.org/drawingml/2006/main" xmlns:pic="http://schemas.openxmlformats.org/drawingml/2006/picture">
@@ -2257,15 +2221,6 @@
     </w:p>
     <w:p>
       <w:pPr/>
-    </w:p>
-    <w:p>
-      <w:pPr/>
-    </w:p>
-    <w:p>
-      <w:pPr/>
-    </w:p>
-    <w:p>
-      <w:pPr/>
       <w:r>
         <w:rPr>
           <w:b/>
@@ -2331,7 +2286,9 @@
       </w:r>
     </w:p>
     <w:p>
-      <w:pPr/>
+      <w:pPr>
+        <w:spacing w:after="240"/>
+      </w:pPr>
       <w:r>
         <w:drawing>
           <wp:inline xmlns:a="http://schemas.openxmlformats.org/drawingml/2006/main" xmlns:pic="http://schemas.openxmlformats.org/drawingml/2006/picture">
@@ -2672,9 +2629,6 @@
     </w:p>
     <w:p>
       <w:pPr/>
-    </w:p>
-    <w:p>
-      <w:pPr/>
       <w:r>
         <w:tab/>
       </w:r>
@@ -3526,7 +3480,9 @@
       </w:r>
     </w:p>
     <w:p>
-      <w:pPr/>
+      <w:pPr>
+        <w:spacing w:after="240"/>
+      </w:pPr>
       <w:r>
         <w:drawing>
           <wp:inline xmlns:a="http://schemas.openxmlformats.org/drawingml/2006/main" xmlns:pic="http://schemas.openxmlformats.org/drawingml/2006/picture">
@@ -3563,10 +3519,9 @@
       </w:r>
     </w:p>
     <w:p>
-      <w:pPr/>
-    </w:p>
-    <w:p>
-      <w:pPr/>
+      <w:pPr>
+        <w:spacing w:after="240"/>
+      </w:pPr>
       <w:r>
         <w:rPr>
           <w:b/>
@@ -3579,9 +3534,6 @@
       <w:r>
         <w:t>Overzicht van contactmomenten en metingen per studiegroep over 18 maanden.</w:t>
       </w:r>
-    </w:p>
-    <w:p>
-      <w:pPr/>
     </w:p>
     <w:p>
       <w:pPr>
@@ -3891,7 +3843,9 @@
       </w:r>
     </w:p>
     <w:p>
-      <w:pPr/>
+      <w:pPr>
+        <w:spacing w:after="240"/>
+      </w:pPr>
       <w:r>
         <w:t xml:space="preserve">Website: </w:t>
       </w:r>
@@ -3909,10 +3863,9 @@
       </w:r>
     </w:p>
     <w:p>
-      <w:pPr/>
-    </w:p>
-    <w:p>
-      <w:pPr/>
+      <w:pPr>
+        <w:spacing w:after="240"/>
+      </w:pPr>
       <w:r>
         <w:rPr>
           <w:b/>
@@ -3929,23 +3882,17 @@
       </w:r>
     </w:p>
     <w:p>
-      <w:pPr/>
-    </w:p>
-    <w:p>
-      <w:pPr/>
+      <w:pPr>
+        <w:spacing w:after="240"/>
+      </w:pPr>
       <w:r>
         <w:t>Conform de Belgische wet van 7 mei 2004 inzake experimenten op de menselijke persoon, is de opdrachtgever zelfs foutloos, aansprakelijk voor alle schade die de deelnemer of zijn rechthebbenden opliepen en die rechtstreeks dan wel onrechtstreeks verband vertoont met het experiment. De opdrachtgever van deze studie, KU Leuven, heeft een verzekering afgesloten die deze aansprakelijkheid dekt. Indien U schade zou oplopen ten gevolge van deelname aan deze studie zal die schade bijgevolg worden vergoed conform de Belgische wet van 7 mei 2004. Als deelnemer aan deze studie bent U gedekt door de verzekeringspolis die de KU Leuven heeft afgesloten bij de verzekeringsmakelaar Amlin Europe NV met adres Koning Albert II Laan 9, 1210 Sint-Joost-ten-Node onder polis nummer 299.053.710. U kunt een kopie van deze verzekeringspolis en de voorwaarden ervan bij uw onderzoeker verkrijgen. Indien er zich in de loop van het onderzoek echter problemen voordoen als gevolg van uw deelname aan de studie, kan er dus beroep worden gedaan op de boven vernoemde afgesloten verzekering, voor alle schade die rechtstreeks of onrechtstreeks verband houden met de studie. Bij eventuele problemen wordt u dan ook verzocht om zo snel mogelijk contact op te nemen met de onderzoeker.</w:t>
-      </w:r>
-    </w:p>
-    <w:p>
-      <w:pPr/>
-      <w:r>
-        <w:br/>
       </w:r>
     </w:p>
     <w:p>
       <w:pPr>
         <w:pStyle w:val="Heading3"/>
+        <w:spacing w:after="240"/>
       </w:pPr>
       <w:r>
         <w:rPr>
@@ -3962,28 +3909,25 @@
     </w:p>
     <w:p>
       <w:pPr/>
+      <w:r>
+        <w:t>De risico’s verbonden aan deze studie zijn beperkt. De meeste procedures komen overeen met de standaardzorg die u normaal gezien ook zou krijgen. Toch kunnen er lichte ongemakken optreden, zoals vermoeidheid door het uitvoeren van testen of lichte huidirritatie door het dragen van steunzolen of sensoren. In zeldzame gevallen kunnen blaren of kleine wondjes ontstaan.</w:t>
+      </w:r>
     </w:p>
     <w:p>
       <w:pPr/>
       <w:r>
-        <w:t>De risico’s verbonden aan deze studie zijn beperkt. De meeste procedures komen overeen met de standaardzorg die u normaal gezien ook zou krijgen. Toch kunnen er lichte ongemakken optreden, zoals vermoeidheid door het uitvoeren van testen of lichte huidirritatie door het dragen van steunzolen of sensoren. In zeldzame gevallen kunnen blaren of kleine wondjes ontstaan.</w:t>
+        <w:t>Aangezien u diabetes heeft, is het belangrijk om extra aandacht te besteden aan de gezondheid van uw voeten. Daarom vragen wij u om eventuele klachten onmiddellijk te melden, ongeacht of u denkt dat deze verband houden met de studie.</w:t>
       </w:r>
     </w:p>
     <w:p>
       <w:pPr/>
       <w:r>
-        <w:t>Aangezien u diabetes heeft, is het belangrijk om extra aandacht te besteden aan de gezondheid van uw voeten. Daarom vragen wij u om eventuele klachten onmiddellijk te melden, ongeacht of u denkt dat deze verband houden met de studie.</w:t>
+        <w:t>Uw deelname aan deze studie kan een direct voordeel opleveren doordat u nauwgezet wordt opgevolgd en aangepaste steunzolen krijgt. Indien u deelneemt aan de uitgebreide (PARADISE) aanpak, kan u bovendien extra begeleiding krijgen die u helpt om uw voeten beter te beschermen. Daarnaast draagt u met uw deelname bij aan wetenschappelijk onderzoek dat in de toekomst andere patiënten kan helpen.</w:t>
       </w:r>
     </w:p>
     <w:p>
       <w:pPr/>
       <w:r>
-        <w:t>Uw deelname aan deze studie kan een direct voordeel opleveren doordat u nauwgezet wordt opgevolgd en aangepaste steunzolen krijgt. Indien u deelneemt aan de uitgebreide (PARADISE) aanpak, kan u bovendien extra begeleiding krijgen die u helpt om uw voeten beter te beschermen. Daarnaast draagt u met uw deelname bij aan wetenschappelijk onderzoek dat in de toekomst andere patiënten kan helpen.</w:t>
-      </w:r>
-    </w:p>
-    <w:p>
-      <w:pPr/>
-      <w:r>
         <w:t>Ook is het mogelijk dat zich andere risico's en ongemakken voordoen die op dit moment nog onbekend zijn. Het is daarom van groot belang om elke nieuwe gezondheidsklacht zo snel mogelijk aan de onderzoeker te melden, ongeacht of de klacht volgens u te maken heeft met de studie of niet.</w:t>
       </w:r>
       <w:r>
@@ -3991,16 +3935,17 @@
       </w:r>
     </w:p>
     <w:p>
-      <w:pPr/>
+      <w:pPr>
+        <w:spacing w:after="240"/>
+      </w:pPr>
       <w:r>
         <w:t>U hebt het recht op elk ogenblik vragen te stellen over de mogelijke en/of gekende risico’s van deze studie. Als er in het verloop van de studie gegevens aan het licht komen die een invloed zouden kunnen hebben op uw bereidheid om te blijven deelnemen aan deze studie, zult u daarvan op de hoogte worden gebracht. Mocht u door uw deelname aan de studie toch enig nadeel ondervinden, zal u een gepaste behandeling krijgen.</w:t>
       </w:r>
     </w:p>
     <w:p>
-      <w:pPr/>
-    </w:p>
-    <w:p>
-      <w:pPr/>
+      <w:pPr>
+        <w:spacing w:after="240"/>
+      </w:pPr>
       <w:r>
         <w:rPr>
           <w:b/>
@@ -4017,10 +3962,9 @@
       </w:r>
     </w:p>
     <w:p>
-      <w:pPr/>
-    </w:p>
-    <w:p>
-      <w:pPr/>
+      <w:pPr>
+        <w:spacing w:after="240"/>
+      </w:pPr>
       <w:r>
         <w:t xml:space="preserve">Uw deelname is vrijwillig. U heeft het recht om uw deelname aan de studie om eender welke reden en zonder opgave van redenen stop te zetten. Wel kan het voor de onderzoeker en de opdrachtgever nuttig zijn om te weten of u zich terugtrekt </w:t>
       </w:r>
@@ -4065,10 +4009,9 @@
       </w:r>
     </w:p>
     <w:p>
-      <w:pPr/>
-    </w:p>
-    <w:p>
-      <w:pPr/>
+      <w:pPr>
+        <w:spacing w:after="240"/>
+      </w:pPr>
       <w:r>
         <w:rPr>
           <w:b/>
@@ -4085,10 +4028,9 @@
       </w:r>
     </w:p>
     <w:p>
-      <w:pPr/>
-    </w:p>
-    <w:p>
-      <w:pPr/>
+      <w:pPr>
+        <w:spacing w:after="240"/>
+      </w:pPr>
       <w:r>
         <w:t>Uw deelname</w:t>
       </w:r>
@@ -4097,10 +4039,9 @@
       </w:r>
     </w:p>
     <w:p>
-      <w:pPr/>
-    </w:p>
-    <w:p>
-      <w:pPr/>
+      <w:pPr>
+        <w:spacing w:after="240"/>
+      </w:pPr>
       <w:r>
         <w:rPr>
           <w:b/>
@@ -4117,10 +4058,9 @@
       </w:r>
     </w:p>
     <w:p>
-      <w:pPr/>
-    </w:p>
-    <w:p>
-      <w:pPr/>
+      <w:pPr>
+        <w:spacing w:after="240"/>
+      </w:pPr>
       <w:r>
         <w:t xml:space="preserve">Voor uw deelname aan deze studie ontvangt u een vergoeding van </w:t>
       </w:r>
@@ -4135,10 +4075,9 @@
       </w:r>
     </w:p>
     <w:p>
-      <w:pPr/>
-    </w:p>
-    <w:p>
-      <w:pPr/>
+      <w:pPr>
+        <w:spacing w:after="240"/>
+      </w:pPr>
       <w:r>
         <w:rPr>
           <w:b/>
@@ -4155,22 +4094,17 @@
       </w:r>
     </w:p>
     <w:p>
-      <w:pPr/>
-    </w:p>
-    <w:p>
-      <w:pPr/>
+      <w:pPr>
+        <w:spacing w:after="360"/>
+      </w:pPr>
       <w:r>
         <w:t>Als er een letsel optreedt ten gevolge van de studie, of als u aanvullende informatie wenst over de studie of over uw rechten en plichten, kunt u in de loop van de studie op elk ogenblik contact opnemen met de arts-onderzoeker of een medewerker van zijn of haar team:</w:t>
       </w:r>
     </w:p>
     <w:p>
-      <w:pPr/>
-    </w:p>
-    <w:p>
-      <w:pPr/>
-    </w:p>
-    <w:p>
-      <w:pPr/>
+      <w:pPr>
+        <w:spacing w:after="240"/>
+      </w:pPr>
       <w:r>
         <w:rPr>
           <w:u w:val="single"/>
@@ -4186,9 +4120,6 @@
     </w:p>
     <w:p>
       <w:pPr/>
-    </w:p>
-    <w:p>
-      <w:pPr/>
       <w:r>
         <w:t xml:space="preserve">Naam: </w:t>
       </w:r>
@@ -4239,7 +4170,9 @@
       </w:r>
     </w:p>
     <w:p>
-      <w:pPr/>
+      <w:pPr>
+        <w:spacing w:after="240"/>
+      </w:pPr>
       <w:r>
         <w:rPr>
           <w:b/>
@@ -4255,9 +4188,6 @@
     </w:p>
     <w:p>
       <w:pPr/>
-    </w:p>
-    <w:p>
-      <w:pPr/>
       <w:r>
         <w:t>Indien u toestemming geeft om deel te nemen aan dit onderzoek, vragen wij u deze brief te ondertekenen.</w:t>
       </w:r>
@@ -4353,6 +4283,7 @@
     <w:p>
       <w:pPr>
         <w:pStyle w:val="ListBullet"/>
+        <w:spacing w:after="240"/>
       </w:pPr>
       <w:r>
         <w:t>Ik heb een exemplaar ontvangen van de informatie aan de deelnemer en de geïnformeerde toestemming.</w:t>
@@ -4362,156 +4293,113 @@
       </w:r>
     </w:p>
     <w:p>
+      <w:pPr>
+        <w:spacing w:after="240"/>
+      </w:pPr>
+      <w:r>
+        <w:t>Naam, voornaam, datum en handtekening van de deelnemer</w:t>
+      </w:r>
+    </w:p>
+    <w:p>
+      <w:pPr>
+        <w:spacing w:after="480"/>
+      </w:pPr>
+      <w:r>
+        <w:t>……………………………………………</w:t>
+      </w:r>
+      <w:r>
+        <w:tab/>
+      </w:r>
+      <w:r>
+        <w:tab/>
+      </w:r>
+      <w:r>
+        <w:tab/>
+      </w:r>
+      <w:r>
+        <w:t>Datum: ………………………….</w:t>
+      </w:r>
+    </w:p>
+    <w:p>
       <w:pPr/>
       <w:r>
+        <w:t>……………………………………………..</w:t>
+      </w:r>
+      <w:r>
+        <w:tab/>
+      </w:r>
+      <w:r>
+        <w:tab/>
+      </w:r>
+      <w:r>
+        <w:tab/>
+      </w:r>
+      <w:r>
+        <w:tab/>
+      </w:r>
+      <w:r>
+        <w:tab/>
+      </w:r>
+      <w:r>
+        <w:tab/>
+      </w:r>
+      <w:r>
+        <w:tab/>
+      </w:r>
+      <w:r>
         <w:t xml:space="preserve"> </w:t>
       </w:r>
     </w:p>
     <w:p>
       <w:pPr/>
       <w:r>
-        <w:t>Naam, voornaam, datum en handtekening van de deelnemer</w:t>
+        <w:t xml:space="preserve">Handtekening </w:t>
+      </w:r>
+      <w:r>
+        <w:t xml:space="preserve">lokake hoofdonderzoeker </w:t>
+      </w:r>
+      <w:r>
+        <w:t xml:space="preserve"> </w:t>
+      </w:r>
+    </w:p>
+    <w:p>
+      <w:pPr>
+        <w:spacing w:after="360"/>
+      </w:pPr>
+      <w:r>
+        <w:t xml:space="preserve">Dr. </w:t>
+      </w:r>
+      <w:r>
+        <w:t xml:space="preserve">XXXXXXX                                                                  </w:t>
+      </w:r>
+      <w:r>
+        <w:t>Datum: …………………………...</w:t>
       </w:r>
     </w:p>
     <w:p>
       <w:pPr/>
       <w:r>
-        <w:t xml:space="preserve"> </w:t>
+        <w:t xml:space="preserve">Ik ondergetekende </w:t>
+      </w:r>
+      <w:r>
+        <w:t xml:space="preserve"> _________________________________ </w:t>
+      </w:r>
+      <w:r>
+        <w:t xml:space="preserve">, onderzoeker/bevoegde onderzoeksmederwerker, verklaar de benodigde informatie inzake deze studie mondeling te hebben verstrekt evenals een exemplaar van het informatiedocument aan de deelnemer te hebben verstrekt. </w:t>
       </w:r>
     </w:p>
     <w:p>
       <w:pPr/>
       <w:r>
-        <w:t>……………………………………………</w:t>
-      </w:r>
-      <w:r>
-        <w:tab/>
-      </w:r>
-      <w:r>
-        <w:tab/>
-      </w:r>
-      <w:r>
-        <w:tab/>
-      </w:r>
-      <w:r>
-        <w:t>Datum: ………………………….</w:t>
-      </w:r>
-    </w:p>
-    <w:p>
-      <w:pPr/>
-      <w:r>
-        <w:t xml:space="preserve"> </w:t>
-      </w:r>
-    </w:p>
-    <w:p>
-      <w:pPr/>
-      <w:r>
-        <w:t xml:space="preserve">  </w:t>
-      </w:r>
-    </w:p>
-    <w:p>
-      <w:pPr/>
-    </w:p>
-    <w:p>
-      <w:pPr/>
-      <w:r>
-        <w:t>……………………………………………..</w:t>
-      </w:r>
-      <w:r>
-        <w:tab/>
-      </w:r>
-      <w:r>
-        <w:tab/>
-      </w:r>
-      <w:r>
-        <w:tab/>
-      </w:r>
-      <w:r>
-        <w:tab/>
-      </w:r>
-      <w:r>
-        <w:tab/>
-      </w:r>
-      <w:r>
-        <w:tab/>
-      </w:r>
-      <w:r>
-        <w:tab/>
-      </w:r>
-      <w:r>
-        <w:t xml:space="preserve"> </w:t>
-      </w:r>
-    </w:p>
-    <w:p>
-      <w:pPr/>
-      <w:r>
-        <w:t xml:space="preserve">Handtekening </w:t>
-      </w:r>
-      <w:r>
-        <w:t xml:space="preserve">lokake hoofdonderzoeker </w:t>
-      </w:r>
-      <w:r>
-        <w:t xml:space="preserve"> </w:t>
-      </w:r>
-    </w:p>
-    <w:p>
-      <w:pPr/>
-      <w:r>
-        <w:t xml:space="preserve">Dr. </w:t>
-      </w:r>
-      <w:r>
-        <w:t xml:space="preserve">XXXXXXX                                                                  </w:t>
-      </w:r>
-      <w:r>
-        <w:t>Datum: …………………………...</w:t>
-      </w:r>
-    </w:p>
-    <w:p>
-      <w:pPr/>
-      <w:r>
-        <w:t xml:space="preserve">    </w:t>
-      </w:r>
-      <w:r>
-        <w:t xml:space="preserve"> </w:t>
-      </w:r>
-    </w:p>
-    <w:p>
-      <w:pPr/>
-      <w:r>
-        <w:t xml:space="preserve"> </w:t>
-      </w:r>
-    </w:p>
-    <w:p>
-      <w:pPr/>
-      <w:r>
-        <w:t xml:space="preserve">Ik ondergetekende </w:t>
-      </w:r>
-      <w:r>
-        <w:t xml:space="preserve"> _________________________________ </w:t>
-      </w:r>
-      <w:r>
-        <w:t xml:space="preserve">, onderzoeker/bevoegde onderzoeksmederwerker, verklaar de benodigde informatie inzake deze studie mondeling te hebben verstrekt evenals een exemplaar van het informatiedocument aan de deelnemer te hebben verstrekt. </w:t>
-      </w:r>
-    </w:p>
-    <w:p>
-      <w:pPr/>
-      <w:r>
         <w:t xml:space="preserve">Ik bevestig dat geen enkele druk op de deelnemer is uitgeoefend om hem/haar te doen toestemmen tot deelname aan de studie en ik ben bereid om op alle eventuele bijkomende vragen te antwoorden. </w:t>
       </w:r>
     </w:p>
     <w:p>
-      <w:pPr/>
+      <w:pPr>
+        <w:spacing w:after="360"/>
+      </w:pPr>
       <w:r>
         <w:t xml:space="preserve">Ik bevestig dat ik werk in overeenstemming met de ethische beginselen zoals vermeld in de laatste versie van de "Verklaring van Helsinki", de "Goede klinische praktijk" en de Belgische wet van 7 mei 2004 inzake experimenten op de menselijke persoon. </w:t>
-      </w:r>
-    </w:p>
-    <w:p>
-      <w:pPr/>
-    </w:p>
-    <w:p>
-      <w:pPr/>
-      <w:r>
-        <w:t xml:space="preserve"> </w:t>
       </w:r>
     </w:p>
     <w:p>
@@ -4545,7 +4433,9 @@
       </w:r>
     </w:p>
     <w:p>
-      <w:pPr/>
+      <w:pPr>
+        <w:spacing w:after="240"/>
+      </w:pPr>
       <w:r>
         <w:rPr>
           <w:b/>
@@ -4561,9 +4451,6 @@
     </w:p>
     <w:p>
       <w:pPr/>
-    </w:p>
-    <w:p>
-      <w:pPr/>
       <w:r>
         <w:t>Indien u toestemming geeft om deel te nemen aan dit onderzoek, vragen wij u deze brief te ondertekenen.</w:t>
       </w:r>
@@ -4659,6 +4546,7 @@
     <w:p>
       <w:pPr>
         <w:pStyle w:val="ListBullet"/>
+        <w:spacing w:after="240"/>
       </w:pPr>
       <w:r>
         <w:t>Ik heb een exemplaar ontvangen van de informatie aan de deelnemer en de geïnformeerde toestemming.</w:t>
@@ -4668,144 +4556,101 @@
       </w:r>
     </w:p>
     <w:p>
+      <w:pPr>
+        <w:spacing w:after="240"/>
+      </w:pPr>
+      <w:r>
+        <w:t>Naam, voornaam, datum en handtekening van de deelnemer</w:t>
+      </w:r>
+    </w:p>
+    <w:p>
+      <w:pPr>
+        <w:spacing w:after="480"/>
+      </w:pPr>
+      <w:r>
+        <w:t>……………………………………………</w:t>
+      </w:r>
+      <w:r>
+        <w:tab/>
+      </w:r>
+      <w:r>
+        <w:tab/>
+      </w:r>
+      <w:r>
+        <w:tab/>
+      </w:r>
+      <w:r>
+        <w:t>Datum: ………………………….</w:t>
+      </w:r>
+    </w:p>
+    <w:p>
       <w:pPr/>
       <w:r>
+        <w:t>……………………………………………..</w:t>
+      </w:r>
+      <w:r>
+        <w:tab/>
+      </w:r>
+      <w:r>
+        <w:tab/>
+      </w:r>
+      <w:r>
+        <w:tab/>
+      </w:r>
+      <w:r>
+        <w:tab/>
+      </w:r>
+      <w:r>
+        <w:tab/>
+      </w:r>
+      <w:r>
+        <w:tab/>
+      </w:r>
+      <w:r>
+        <w:tab/>
+      </w:r>
+      <w:r>
         <w:t xml:space="preserve"> </w:t>
       </w:r>
     </w:p>
     <w:p>
       <w:pPr/>
       <w:r>
-        <w:t>Naam, voornaam, datum en handtekening van de deelnemer</w:t>
+        <w:t xml:space="preserve">Handtekening lokake hoofdonderzoeker  </w:t>
+      </w:r>
+    </w:p>
+    <w:p>
+      <w:pPr>
+        <w:spacing w:after="360"/>
+      </w:pPr>
+      <w:r>
+        <w:t xml:space="preserve">Dr. </w:t>
+      </w:r>
+      <w:r>
+        <w:t xml:space="preserve">XXXXXXX                                                                  </w:t>
+      </w:r>
+      <w:r>
+        <w:t>Datum: …………………………...</w:t>
       </w:r>
     </w:p>
     <w:p>
       <w:pPr/>
       <w:r>
-        <w:t xml:space="preserve"> </w:t>
+        <w:t xml:space="preserve">Ik ondergetekende  _________________________________ , onderzoeker/bevoegde onderzoeksmederwerker, verklaar de benodigde informatie inzake deze studie mondeling te hebben verstrekt evenals een exemplaar van het informatiedocument aan de deelnemer te hebben verstrekt. </w:t>
       </w:r>
     </w:p>
     <w:p>
       <w:pPr/>
       <w:r>
-        <w:t>……………………………………………</w:t>
-      </w:r>
-      <w:r>
-        <w:tab/>
-      </w:r>
-      <w:r>
-        <w:tab/>
-      </w:r>
-      <w:r>
-        <w:tab/>
-      </w:r>
-      <w:r>
-        <w:t>Datum: ………………………….</w:t>
-      </w:r>
-    </w:p>
-    <w:p>
-      <w:pPr/>
-      <w:r>
-        <w:t xml:space="preserve"> </w:t>
-      </w:r>
-    </w:p>
-    <w:p>
-      <w:pPr/>
-      <w:r>
-        <w:t xml:space="preserve">  </w:t>
-      </w:r>
-    </w:p>
-    <w:p>
-      <w:pPr/>
-    </w:p>
-    <w:p>
-      <w:pPr/>
-      <w:r>
-        <w:t>……………………………………………..</w:t>
-      </w:r>
-      <w:r>
-        <w:tab/>
-      </w:r>
-      <w:r>
-        <w:tab/>
-      </w:r>
-      <w:r>
-        <w:tab/>
-      </w:r>
-      <w:r>
-        <w:tab/>
-      </w:r>
-      <w:r>
-        <w:tab/>
-      </w:r>
-      <w:r>
-        <w:tab/>
-      </w:r>
-      <w:r>
-        <w:tab/>
-      </w:r>
-      <w:r>
-        <w:t xml:space="preserve"> </w:t>
-      </w:r>
-    </w:p>
-    <w:p>
-      <w:pPr/>
-      <w:r>
-        <w:t xml:space="preserve">Handtekening lokake hoofdonderzoeker  </w:t>
-      </w:r>
-    </w:p>
-    <w:p>
-      <w:pPr/>
-      <w:r>
-        <w:t xml:space="preserve">Dr. </w:t>
-      </w:r>
-      <w:r>
-        <w:t xml:space="preserve">XXXXXXX                                                                  </w:t>
-      </w:r>
-      <w:r>
-        <w:t>Datum: …………………………...</w:t>
-      </w:r>
-    </w:p>
-    <w:p>
-      <w:pPr/>
-      <w:r>
-        <w:t xml:space="preserve">    </w:t>
-      </w:r>
-      <w:r>
-        <w:t xml:space="preserve"> </w:t>
-      </w:r>
-    </w:p>
-    <w:p>
-      <w:pPr/>
-      <w:r>
-        <w:t xml:space="preserve"> </w:t>
-      </w:r>
-    </w:p>
-    <w:p>
-      <w:pPr/>
-      <w:r>
-        <w:t xml:space="preserve">Ik ondergetekende  _________________________________ , onderzoeker/bevoegde onderzoeksmederwerker, verklaar de benodigde informatie inzake deze studie mondeling te hebben verstrekt evenals een exemplaar van het informatiedocument aan de deelnemer te hebben verstrekt. </w:t>
-      </w:r>
-    </w:p>
-    <w:p>
-      <w:pPr/>
-      <w:r>
         <w:t xml:space="preserve">Ik bevestig dat geen enkele druk op de deelnemer is uitgeoefend om hem/haar te doen toestemmen tot deelname aan de studie en ik ben bereid om op alle eventuele bijkomende vragen te antwoorden. </w:t>
       </w:r>
     </w:p>
     <w:p>
-      <w:pPr/>
+      <w:pPr>
+        <w:spacing w:after="360"/>
+      </w:pPr>
       <w:r>
         <w:t xml:space="preserve">Ik bevestig dat ik werk in overeenstemming met de ethische beginselen zoals vermeld in de laatste versie van de "Verklaring van Helsinki", de "Goede klinische praktijk" en de Belgische wet van 7 mei 2004 inzake experimenten op de menselijke persoon. </w:t>
-      </w:r>
-    </w:p>
-    <w:p>
-      <w:pPr/>
-    </w:p>
-    <w:p>
-      <w:pPr/>
-      <w:r>
-        <w:t xml:space="preserve"> </w:t>
       </w:r>
     </w:p>
     <w:p>
@@ -4842,7 +4687,9 @@
       </w:r>
     </w:p>
     <w:p>
-      <w:pPr/>
+      <w:pPr>
+        <w:spacing w:after="240"/>
+      </w:pPr>
       <w:r>
         <w:rPr>
           <w:b/>
@@ -4851,16 +4698,12 @@
       </w:r>
     </w:p>
     <w:p>
-      <w:pPr/>
-    </w:p>
-    <w:p>
-      <w:pPr/>
+      <w:pPr>
+        <w:spacing w:after="240"/>
+      </w:pPr>
       <w:r>
         <w:t>1. Studiegegevens</w:t>
       </w:r>
-    </w:p>
-    <w:p>
-      <w:pPr/>
     </w:p>
     <w:p>
       <w:pPr>
@@ -5087,7 +4930,9 @@
       </w:r>
     </w:p>
     <w:p>
-      <w:pPr/>
+      <w:pPr>
+        <w:spacing w:after="240"/>
+      </w:pPr>
       <w:r>
         <w:t>⚠</w:t>
       </w:r>
@@ -5106,9 +4951,6 @@
     </w:p>
     <w:p>
       <w:pPr/>
-    </w:p>
-    <w:p>
-      <w:pPr/>
       <w:r>
         <w:t>5. Vergoeding</w:t>
       </w:r>
@@ -5168,7 +5010,9 @@
       </w:r>
     </w:p>
     <w:p>
-      <w:pPr/>
+      <w:pPr>
+        <w:spacing w:after="240"/>
+      </w:pPr>
       <w:r>
         <w:t>⚠</w:t>
       </w:r>
@@ -5187,9 +5031,6 @@
     </w:p>
     <w:p>
       <w:pPr/>
-    </w:p>
-    <w:p>
-      <w:pPr/>
       <w:r>
         <w:t>6. Verklaring en toestemming van de deelnemer</w:t>
       </w:r>
@@ -5227,16 +5068,16 @@
     <w:p>
       <w:pPr>
         <w:pStyle w:val="ListBullet"/>
+        <w:spacing w:after="240"/>
       </w:pPr>
       <w:r>
         <w:t>ik begrijp dat deze vergoeding geen invloed heeft op mijn deelname aan de studie en geen loon betreft.</w:t>
       </w:r>
     </w:p>
     <w:p>
-      <w:pPr/>
-    </w:p>
-    <w:p>
-      <w:pPr/>
+      <w:pPr>
+        <w:spacing w:after="360"/>
+      </w:pPr>
       <w:r>
         <w:t>⚠</w:t>
       </w:r>
@@ -5255,30 +5096,23 @@
     </w:p>
     <w:p>
       <w:pPr/>
+      <w:r>
+        <w:t>7. Handtekeningen</w:t>
+      </w:r>
     </w:p>
     <w:p>
       <w:pPr/>
-    </w:p>
-    <w:p>
-      <w:pPr/>
-      <w:r>
-        <w:t>7. Handtekeningen</w:t>
-      </w:r>
-    </w:p>
-    <w:p>
-      <w:pPr/>
       <w:r>
         <w:t>Naam deelnemer: _____________________________________________</w:t>
       </w:r>
     </w:p>
     <w:p>
-      <w:pPr/>
+      <w:pPr>
+        <w:spacing w:after="240"/>
+      </w:pPr>
       <w:r>
         <w:t>Handtekening deelnemer: _____________ Datum (dag/maand/jaar): _____ / _____ / _____</w:t>
       </w:r>
-    </w:p>
-    <w:p>
-      <w:pPr/>
     </w:p>
     <w:p>
       <w:pPr/>
@@ -5350,6 +5184,7 @@
     <w:p>
       <w:pPr>
         <w:pStyle w:val="ListBullet"/>
+        <w:spacing w:after="240"/>
       </w:pPr>
       <w:r>
         <w:t>Kostenplaats / projectnummer: ______________________________</w:t>
@@ -5359,22 +5194,18 @@
       </w:r>
     </w:p>
     <w:p>
+      <w:pPr>
+        <w:spacing w:after="240"/>
+      </w:pPr>
+      <w:r>
+        <w:t>Privacyverklaring</w:t>
+      </w:r>
+      <w:r>
+        <w:t xml:space="preserve"> </w:t>
+      </w:r>
+    </w:p>
+    <w:p>
       <w:pPr/>
-    </w:p>
-    <w:p>
-      <w:pPr/>
-      <w:r>
-        <w:t>Privacyverklaring</w:t>
-      </w:r>
-      <w:r>
-        <w:t xml:space="preserve"> </w:t>
-      </w:r>
-    </w:p>
-    <w:p>
-      <w:pPr/>
-    </w:p>
-    <w:p>
-      <w:pPr/>
       <w:r>
         <w:t xml:space="preserve">De persoonsgegevens in dit formulier worden verwerkt door </w:t>
       </w:r>
@@ -5386,19 +5217,12 @@
       </w:r>
       <w:r>
         <w:t xml:space="preserve"> in het kader van klinisch onderzoek en financiële administratie. Deze gegevens worden niet langer bewaard dan noodzakelijk en worden niet gedeeld met derden, behalve indien wettelijk vereist.</w:t>
-      </w:r>
-    </w:p>
-    <w:p>
-      <w:pPr/>
-    </w:p>
-    <w:p>
-      <w:r>
-        <w:br w:type="page"/>
       </w:r>
     </w:p>
     <w:p>
       <w:pPr>
         <w:pStyle w:val="Heading1"/>
+        <w:pageBreakBefore/>
       </w:pPr>
       <w:r>
         <w:t>Information and informed consent form for treating professionals</w:t>
@@ -5851,7 +5675,9 @@
       </w:hyperlink>
     </w:p>
     <w:p>
-      <w:pPr/>
+      <w:pPr>
+        <w:spacing w:after="240"/>
+      </w:pPr>
       <w:r>
         <w:t xml:space="preserve">Dr. Gertjan Vereecke, AZ </w:t>
       </w:r>
@@ -5875,9 +5701,6 @@
       </w:hyperlink>
     </w:p>
     <w:p>
-      <w:pPr/>
-    </w:p>
-    <w:p>
       <w:pPr>
         <w:pStyle w:val="Heading2"/>
       </w:pPr>
@@ -5897,7 +5720,9 @@
       </w:r>
     </w:p>
     <w:p>
-      <w:pPr/>
+      <w:pPr>
+        <w:spacing w:after="240"/>
+      </w:pPr>
       <w:r>
         <w:t xml:space="preserve">U </w:t>
       </w:r>
@@ -6248,10 +6073,9 @@
       </w:r>
     </w:p>
     <w:p>
-      <w:pPr/>
-    </w:p>
-    <w:p>
-      <w:pPr/>
+      <w:pPr>
+        <w:spacing w:after="240"/>
+      </w:pPr>
       <w:r>
         <w:t>Deze</w:t>
       </w:r>
@@ -6362,16 +6186,12 @@
       </w:r>
     </w:p>
     <w:p>
-      <w:pPr/>
-    </w:p>
-    <w:p>
-      <w:pPr/>
+      <w:pPr>
+        <w:spacing w:after="240"/>
+      </w:pPr>
       <w:r>
         <w:t>Wij vragen u de volgende pagina’s met informatie aandachtig te lezen. Hebt u vragen, dan kan u terecht bij de arts-onderzoeker of zijn of haar vertegenwoordiger. Dit document bestaat uit 3 delen: essentiële informatie die u nodig heeft voor het nemen van uw beslissing, uw schriftelijke toestemming en bijlagen waarin u meer details terugvindt over bepaalde onderdelen van de basisinformatie.</w:t>
       </w:r>
-    </w:p>
-    <w:p>
-      <w:pPr/>
     </w:p>
     <w:p>
       <w:pPr/>
@@ -6464,6 +6284,7 @@
     <w:p>
       <w:pPr>
         <w:pStyle w:val="ListBullet"/>
+        <w:spacing w:after="240"/>
       </w:pPr>
       <w:r>
         <w:t>Indien</w:t>
@@ -6476,43 +6297,30 @@
       </w:r>
     </w:p>
     <w:p>
+      <w:pPr>
+        <w:spacing w:after="240"/>
+      </w:pPr>
+      <w:r>
+        <w:t xml:space="preserve">Alvast bedankt voor uw </w:t>
+      </w:r>
+      <w:r>
+        <w:t xml:space="preserve">tijd en </w:t>
+      </w:r>
+      <w:r>
+        <w:t>interesse.</w:t>
+      </w:r>
+      <w:r>
+        <w:t xml:space="preserve"> </w:t>
+      </w:r>
+    </w:p>
+    <w:p>
       <w:pPr/>
       <w:r>
+        <w:t>Hoogachtend,</w:t>
+      </w:r>
+      <w:r>
         <w:t xml:space="preserve"> </w:t>
       </w:r>
-    </w:p>
-    <w:p>
-      <w:pPr/>
-      <w:r>
-        <w:t xml:space="preserve">Alvast bedankt voor uw </w:t>
-      </w:r>
-      <w:r>
-        <w:t xml:space="preserve">tijd en </w:t>
-      </w:r>
-      <w:r>
-        <w:t>interesse.</w:t>
-      </w:r>
-      <w:r>
-        <w:t xml:space="preserve"> </w:t>
-      </w:r>
-    </w:p>
-    <w:p>
-      <w:pPr/>
-      <w:r>
-        <w:t xml:space="preserve"> </w:t>
-      </w:r>
-    </w:p>
-    <w:p>
-      <w:pPr/>
-      <w:r>
-        <w:t>Hoogachtend,</w:t>
-      </w:r>
-      <w:r>
-        <w:t xml:space="preserve"> </w:t>
-      </w:r>
-    </w:p>
-    <w:p>
-      <w:pPr/>
     </w:p>
     <w:tbl>
       <w:tblPr>
@@ -6547,22 +6355,10 @@
         </w:tc>
       </w:tr>
     </w:tbl>
-    <w:p/>
-    <w:p>
-      <w:pPr/>
-    </w:p>
-    <w:p>
-      <w:pPr/>
-    </w:p>
-    <w:p>
-      <w:pPr/>
-    </w:p>
-    <w:p>
-      <w:pPr/>
-    </w:p>
     <w:p>
       <w:pPr>
         <w:pStyle w:val="Heading3"/>
+        <w:spacing w:after="240"/>
       </w:pPr>
       <w:r>
         <w:t xml:space="preserve">3. </w:t>
@@ -6579,9 +6375,6 @@
       <w:r>
         <w:t xml:space="preserve"> van de studie</w:t>
       </w:r>
-    </w:p>
-    <w:p>
-      <w:pPr/>
     </w:p>
     <w:p>
       <w:pPr/>
@@ -8759,7 +8552,9 @@
       </w:r>
     </w:p>
     <w:p>
-      <w:pPr/>
+      <w:pPr>
+        <w:spacing w:after="240"/>
+      </w:pPr>
       <w:r>
         <w:rPr>
           <w:b/>
@@ -8769,9 +8564,6 @@
     </w:p>
     <w:p>
       <w:pPr/>
-    </w:p>
-    <w:p>
-      <w:pPr/>
       <w:r>
         <w:t xml:space="preserve">Als u bijkomende informatie wenst, maar ook ingeval van problemen of als u zich zorgen maakt, kan u contact opnemen met de </w:t>
       </w:r>
@@ -8911,7 +8703,9 @@
       </w:r>
     </w:p>
     <w:p>
-      <w:pPr/>
+      <w:pPr>
+        <w:spacing w:after="360"/>
+      </w:pPr>
       <w:r>
         <w:t xml:space="preserve">Deelname aan dit onderzoek zal voor u geen </w:t>
       </w:r>
@@ -8929,16 +8723,9 @@
       </w:r>
     </w:p>
     <w:p>
-      <w:pPr/>
-    </w:p>
-    <w:p>
-      <w:pPr/>
-      <w:r>
-        <w:br/>
-      </w:r>
-    </w:p>
-    <w:p>
-      <w:pPr/>
+      <w:pPr>
+        <w:spacing w:after="240"/>
+      </w:pPr>
       <w:r>
         <w:rPr>
           <w:b/>
@@ -8953,10 +8740,9 @@
       </w:r>
     </w:p>
     <w:p>
-      <w:pPr/>
-    </w:p>
-    <w:p>
-      <w:pPr/>
+      <w:pPr>
+        <w:spacing w:after="360"/>
+      </w:pPr>
       <w:r>
         <w:rPr>
           <w:b/>
@@ -8996,234 +8782,229 @@
     </w:p>
     <w:p>
       <w:pPr/>
+      <w:r>
+        <w:t>Ik verklaar dat ik geïnformeerd ben over de aard, het doel, de duur</w:t>
+      </w:r>
+      <w:r>
+        <w:t>,</w:t>
+      </w:r>
+      <w:r>
+        <w:t xml:space="preserve"> de eventuele </w:t>
+      </w:r>
+      <w:r>
+        <w:t>voordelen</w:t>
+      </w:r>
+      <w:r>
+        <w:t xml:space="preserve"> en risico’s van de studie en dat ik weet wat van mij wordt verwacht. </w:t>
+      </w:r>
     </w:p>
     <w:p>
       <w:pPr/>
+      <w:r>
+        <w:t xml:space="preserve">Ik heb </w:t>
+      </w:r>
+      <w:r>
+        <w:t>kennis genomen</w:t>
+      </w:r>
+      <w:r>
+        <w:t xml:space="preserve"> van het informatiedocument en de bijlagen ervan.</w:t>
+      </w:r>
     </w:p>
     <w:p>
       <w:pPr/>
       <w:r>
-        <w:t>Ik verklaar dat ik geïnformeerd ben over de aard, het doel, de duur</w:t>
-      </w:r>
-      <w:r>
-        <w:t>,</w:t>
-      </w:r>
-      <w:r>
-        <w:t xml:space="preserve"> de eventuele </w:t>
-      </w:r>
-      <w:r>
-        <w:t>voordelen</w:t>
-      </w:r>
-      <w:r>
-        <w:t xml:space="preserve"> en risico’s van de studie en dat ik weet wat van mij wordt verwacht. </w:t>
+        <w:t xml:space="preserve">Ik heb voldoende tijd gehad om na te denken en met een door mij gekozen persoon, </w:t>
+      </w:r>
+      <w:r>
+        <w:t xml:space="preserve">bijvoorbeeld een </w:t>
+      </w:r>
+      <w:r>
+        <w:t>familielid, te praten.</w:t>
       </w:r>
     </w:p>
     <w:p>
       <w:pPr/>
       <w:r>
-        <w:t xml:space="preserve">Ik heb </w:t>
-      </w:r>
-      <w:r>
-        <w:t>kennis genomen</w:t>
-      </w:r>
-      <w:r>
-        <w:t xml:space="preserve"> van het informatiedocument en de bijlagen ervan.</w:t>
+        <w:t>Ik heb alle vragen kunnen stellen die bij me opkwamen en ik heb een duidelijk antwoord gekregen op mijn vragen.</w:t>
       </w:r>
     </w:p>
     <w:p>
       <w:pPr/>
       <w:r>
-        <w:t xml:space="preserve">Ik heb voldoende tijd gehad om na te denken en met een door mij gekozen persoon, </w:t>
-      </w:r>
-      <w:r>
-        <w:t xml:space="preserve">bijvoorbeeld een </w:t>
-      </w:r>
-      <w:r>
-        <w:t>familielid, te praten.</w:t>
+        <w:t xml:space="preserve">Ik begrijp dat mijn deelname aan deze studie vrijwillig is en dat ik vrij ben mijn deelname aan deze studie stop te zetten zonder dat dit mijn relatie schaadt met </w:t>
+      </w:r>
+      <w:r>
+        <w:t>mijn leidinggevende</w:t>
+      </w:r>
+      <w:r>
+        <w:t xml:space="preserve"> d</w:t>
+      </w:r>
+      <w:r>
+        <w:t>ie</w:t>
+      </w:r>
+      <w:r>
+        <w:t xml:space="preserve"> instaat voor mijn </w:t>
+      </w:r>
+      <w:r>
+        <w:t>werk</w:t>
+      </w:r>
+      <w:r>
+        <w:t>.</w:t>
       </w:r>
     </w:p>
     <w:p>
       <w:pPr/>
       <w:r>
-        <w:t>Ik heb alle vragen kunnen stellen die bij me opkwamen en ik heb een duidelijk antwoord gekregen op mijn vragen.</w:t>
+        <w:t xml:space="preserve">Ik begrijp dat er tijdens mijn deelname aan </w:t>
+      </w:r>
+      <w:r>
+        <w:t>deze</w:t>
+      </w:r>
+      <w:r>
+        <w:t xml:space="preserve"> studie gegevens over mij zullen worden verzameld en dat </w:t>
+      </w:r>
+      <w:r>
+        <w:t>de arts-onderzoeker en de opdrachtgever de vertrouwelijkheid van deze gegevens verzekeren overeenkomstig de Europese en Belgische</w:t>
+      </w:r>
+      <w:r>
+        <w:t xml:space="preserve"> wetgeving ter zake.</w:t>
+      </w:r>
+      <w:r>
+        <w:t xml:space="preserve"> Ik begrijp dat </w:t>
+      </w:r>
+      <w:r>
+        <w:t xml:space="preserve">het uitvoeren van deze studie door KU Leuven het algemeen belang dient en </w:t>
+      </w:r>
+      <w:r>
+        <w:t xml:space="preserve">de verwerking </w:t>
+      </w:r>
+      <w:r>
+        <w:t xml:space="preserve">van mijn persoonsgegevens noodzakelijk is </w:t>
+      </w:r>
+      <w:r>
+        <w:t xml:space="preserve">voor het uitvoeren van </w:t>
+      </w:r>
+      <w:r>
+        <w:t>deze studie.</w:t>
+      </w:r>
+      <w:r>
+        <w:t xml:space="preserve"> </w:t>
       </w:r>
     </w:p>
     <w:p>
       <w:pPr/>
       <w:r>
-        <w:t xml:space="preserve">Ik begrijp dat mijn deelname aan deze studie vrijwillig is en dat ik vrij ben mijn deelname aan deze studie stop te zetten zonder dat dit mijn relatie schaadt met </w:t>
-      </w:r>
-      <w:r>
-        <w:t>mijn leidinggevende</w:t>
-      </w:r>
-      <w:r>
-        <w:t xml:space="preserve"> d</w:t>
-      </w:r>
-      <w:r>
-        <w:t>ie</w:t>
-      </w:r>
-      <w:r>
-        <w:t xml:space="preserve"> instaat voor mijn </w:t>
-      </w:r>
-      <w:r>
-        <w:t>werk</w:t>
+        <w:t xml:space="preserve">Ik begrijp dat deze </w:t>
+      </w:r>
+      <w:r>
+        <w:t xml:space="preserve">studie deel uitmaakt van een gezamenlijk project tussen KU Leuven, VUB en </w:t>
+      </w:r>
+      <w:r>
+        <w:t>zes diabetesvoetklinieken (</w:t>
+      </w:r>
+      <w:r>
+        <w:t>UZGent</w:t>
+      </w:r>
+      <w:r>
+        <w:t xml:space="preserve">, </w:t>
+      </w:r>
+      <w:r>
+        <w:t>UZAntwerpen</w:t>
+      </w:r>
+      <w:r>
+        <w:t xml:space="preserve">, AZ </w:t>
+      </w:r>
+      <w:r>
+        <w:t>Groeninge</w:t>
+      </w:r>
+      <w:r>
+        <w:t xml:space="preserve">, AZ Sint-Jan, </w:t>
+      </w:r>
+      <w:r>
+        <w:t>Azorg</w:t>
+      </w:r>
+      <w:r>
+        <w:t xml:space="preserve">, </w:t>
+      </w:r>
+      <w:r>
+        <w:t>UZLeuven</w:t>
+      </w:r>
+      <w:r>
+        <w:t>)</w:t>
+      </w:r>
+      <w:r>
+        <w:t xml:space="preserve">. De </w:t>
+      </w:r>
+      <w:r>
+        <w:t xml:space="preserve">studiegegevens </w:t>
+      </w:r>
+      <w:r>
+        <w:t xml:space="preserve">zullen </w:t>
+      </w:r>
+      <w:r>
+        <w:t>vertrouwelijk tussen de drie project partners gedeeld worden om het welslagen van dit project mogelijk te maken.</w:t>
+      </w:r>
+      <w:r>
+        <w:t xml:space="preserve"> </w:t>
+      </w:r>
+    </w:p>
+    <w:p>
+      <w:pPr/>
+      <w:r>
+        <w:t xml:space="preserve">Ik geef toestemming dat er in het kader van deze klinische studie een geluidsopname wordt gemaakt van het interview om later door de onderzoeker uitgeschreven te worden. Nadat het interview is uitgeschreven wordt de geluidsopname onmiddellijk verwijderd. Deze gegevens zullen enkel in groep gerapporteerd worden en nooit individueel. Deze data </w:t>
+      </w:r>
+      <w:r>
+        <w:t>wordt</w:t>
+      </w:r>
+      <w:r>
+        <w:t xml:space="preserve"> volledig vertrouwelijk behandeld.</w:t>
+      </w:r>
+    </w:p>
+    <w:p>
+      <w:pPr/>
+      <w:r>
+        <w:t xml:space="preserve">Ik geef toestemming dat er in het kader van deze klinische studies video-opnames, waarin ik herkenbaar ben, worden gemaakt </w:t>
+      </w:r>
+      <w:r>
+        <w:t xml:space="preserve">mijn klinische interventie </w:t>
+      </w:r>
+      <w:r>
+        <w:t xml:space="preserve">die ik geef aan de patiënt. Na analyse worden deze video-opnames onmiddellijk verwijderd. Deze gegevens zullen enkel in groep gerapporteerd worden en nooit individueel. Deze data </w:t>
+      </w:r>
+      <w:r>
+        <w:t>worden</w:t>
+      </w:r>
+      <w:r>
+        <w:t xml:space="preserve"> volledig vertrouwelijk behandeld.</w:t>
+      </w:r>
+    </w:p>
+    <w:p>
+      <w:pPr/>
+      <w:r>
+        <w:t xml:space="preserve">Ik geef toestemming dat de data die voortvloeit uit mijn deelname aan de studie, mag gebruikt worden in andere, toekomstige, wetenschappelijke studies van de </w:t>
+      </w:r>
+      <w:r>
+        <w:t>voormelde</w:t>
+      </w:r>
+      <w:r>
+        <w:t xml:space="preserve"> project partners</w:t>
       </w:r>
       <w:r>
         <w:t>.</w:t>
       </w:r>
     </w:p>
     <w:p>
-      <w:pPr/>
-      <w:r>
-        <w:t xml:space="preserve">Ik begrijp dat er tijdens mijn deelname aan </w:t>
-      </w:r>
-      <w:r>
-        <w:t>deze</w:t>
-      </w:r>
-      <w:r>
-        <w:t xml:space="preserve"> studie gegevens over mij zullen worden verzameld en dat </w:t>
-      </w:r>
-      <w:r>
-        <w:t>de arts-onderzoeker en de opdrachtgever de vertrouwelijkheid van deze gegevens verzekeren overeenkomstig de Europese en Belgische</w:t>
-      </w:r>
-      <w:r>
-        <w:t xml:space="preserve"> wetgeving ter zake.</w:t>
-      </w:r>
-      <w:r>
-        <w:t xml:space="preserve"> Ik begrijp dat </w:t>
-      </w:r>
-      <w:r>
-        <w:t xml:space="preserve">het uitvoeren van deze studie door KU Leuven het algemeen belang dient en </w:t>
-      </w:r>
-      <w:r>
-        <w:t xml:space="preserve">de verwerking </w:t>
-      </w:r>
-      <w:r>
-        <w:t xml:space="preserve">van mijn persoonsgegevens noodzakelijk is </w:t>
-      </w:r>
-      <w:r>
-        <w:t xml:space="preserve">voor het uitvoeren van </w:t>
-      </w:r>
-      <w:r>
-        <w:t>deze studie.</w:t>
-      </w:r>
-      <w:r>
-        <w:t xml:space="preserve"> </w:t>
-      </w:r>
-    </w:p>
-    <w:p>
-      <w:pPr/>
-      <w:r>
-        <w:t xml:space="preserve">Ik begrijp dat deze </w:t>
-      </w:r>
-      <w:r>
-        <w:t xml:space="preserve">studie deel uitmaakt van een gezamenlijk project tussen KU Leuven, VUB en </w:t>
-      </w:r>
-      <w:r>
-        <w:t>zes diabetesvoetklinieken (</w:t>
-      </w:r>
-      <w:r>
-        <w:t>UZGent</w:t>
-      </w:r>
-      <w:r>
-        <w:t xml:space="preserve">, </w:t>
-      </w:r>
-      <w:r>
-        <w:t>UZAntwerpen</w:t>
-      </w:r>
-      <w:r>
-        <w:t xml:space="preserve">, AZ </w:t>
-      </w:r>
-      <w:r>
-        <w:t>Groeninge</w:t>
-      </w:r>
-      <w:r>
-        <w:t xml:space="preserve">, AZ Sint-Jan, </w:t>
-      </w:r>
-      <w:r>
-        <w:t>Azorg</w:t>
-      </w:r>
-      <w:r>
-        <w:t xml:space="preserve">, </w:t>
-      </w:r>
-      <w:r>
-        <w:t>UZLeuven</w:t>
-      </w:r>
-      <w:r>
-        <w:t>)</w:t>
-      </w:r>
-      <w:r>
-        <w:t xml:space="preserve">. De </w:t>
-      </w:r>
-      <w:r>
-        <w:t xml:space="preserve">studiegegevens </w:t>
-      </w:r>
-      <w:r>
-        <w:t xml:space="preserve">zullen </w:t>
-      </w:r>
-      <w:r>
-        <w:t>vertrouwelijk tussen de drie project partners gedeeld worden om het welslagen van dit project mogelijk te maken.</w:t>
-      </w:r>
-      <w:r>
-        <w:t xml:space="preserve"> </w:t>
-      </w:r>
-    </w:p>
-    <w:p>
-      <w:pPr/>
-      <w:r>
-        <w:t xml:space="preserve">Ik geef toestemming dat er in het kader van deze klinische studie een geluidsopname wordt gemaakt van het interview om later door de onderzoeker uitgeschreven te worden. Nadat het interview is uitgeschreven wordt de geluidsopname onmiddellijk verwijderd. Deze gegevens zullen enkel in groep gerapporteerd worden en nooit individueel. Deze data </w:t>
-      </w:r>
-      <w:r>
-        <w:t>wordt</w:t>
-      </w:r>
-      <w:r>
-        <w:t xml:space="preserve"> volledig vertrouwelijk behandeld.</w:t>
-      </w:r>
-    </w:p>
-    <w:p>
-      <w:pPr/>
-      <w:r>
-        <w:t xml:space="preserve">Ik geef toestemming dat er in het kader van deze klinische studies video-opnames, waarin ik herkenbaar ben, worden gemaakt </w:t>
-      </w:r>
-      <w:r>
-        <w:t xml:space="preserve">mijn klinische interventie </w:t>
-      </w:r>
-      <w:r>
-        <w:t xml:space="preserve">die ik geef aan de patiënt. Na analyse worden deze video-opnames onmiddellijk verwijderd. Deze gegevens zullen enkel in groep gerapporteerd worden en nooit individueel. Deze data </w:t>
-      </w:r>
-      <w:r>
-        <w:t>worden</w:t>
-      </w:r>
-      <w:r>
-        <w:t xml:space="preserve"> volledig vertrouwelijk behandeld.</w:t>
-      </w:r>
-    </w:p>
-    <w:p>
-      <w:pPr/>
-      <w:r>
-        <w:t xml:space="preserve">Ik geef toestemming dat de data die voortvloeit uit mijn deelname aan de studie, mag gebruikt worden in andere, toekomstige, wetenschappelijke studies van de </w:t>
-      </w:r>
-      <w:r>
-        <w:t>voormelde</w:t>
-      </w:r>
-      <w:r>
-        <w:t xml:space="preserve"> project partners</w:t>
-      </w:r>
-      <w:r>
-        <w:t>.</w:t>
-      </w:r>
-    </w:p>
-    <w:p>
-      <w:pPr/>
+      <w:pPr>
+        <w:spacing w:after="240"/>
+      </w:pPr>
       <w:r>
         <w:t>Ik heb een exemplaar ontvangen van de informatie aan de deelnemer en de geïnformeerde toestemming.</w:t>
       </w:r>
     </w:p>
     <w:p>
-      <w:pPr/>
-    </w:p>
-    <w:p>
-      <w:pPr/>
+      <w:pPr>
+        <w:spacing w:after="480"/>
+      </w:pPr>
       <w:r>
         <w:t>Naam</w:t>
       </w:r>
@@ -9241,19 +9022,9 @@
       </w:r>
     </w:p>
     <w:p>
-      <w:pPr/>
-    </w:p>
-    <w:p>
-      <w:pPr/>
-    </w:p>
-    <w:p>
-      <w:pPr/>
-    </w:p>
-    <w:p>
-      <w:pPr/>
-    </w:p>
-    <w:p>
-      <w:pPr/>
+      <w:pPr>
+        <w:spacing w:after="480"/>
+      </w:pPr>
       <w:r>
         <w:t>D</w:t>
       </w:r>
@@ -9265,63 +9036,14 @@
       </w:r>
     </w:p>
     <w:p>
-      <w:pPr/>
-    </w:p>
-    <w:p>
-      <w:pPr/>
-    </w:p>
-    <w:p>
-      <w:pPr/>
-    </w:p>
-    <w:p>
-      <w:pPr/>
-    </w:p>
-    <w:p>
-      <w:pPr/>
+      <w:pPr>
+        <w:spacing w:after="480"/>
+      </w:pPr>
       <w:r>
         <w:t>H</w:t>
       </w:r>
       <w:r>
         <w:t>andtekening van de deelnemer</w:t>
-      </w:r>
-    </w:p>
-    <w:p>
-      <w:pPr/>
-    </w:p>
-    <w:p>
-      <w:pPr/>
-    </w:p>
-    <w:p>
-      <w:pPr/>
-    </w:p>
-    <w:p>
-      <w:pPr/>
-    </w:p>
-    <w:p>
-      <w:pPr/>
-    </w:p>
-    <w:p>
-      <w:pPr/>
-      <w:r>
-        <w:t xml:space="preserve"> </w:t>
-      </w:r>
-      <w:r>
-        <w:tab/>
-      </w:r>
-      <w:r>
-        <w:tab/>
-      </w:r>
-      <w:r>
-        <w:tab/>
-      </w:r>
-      <w:r>
-        <w:tab/>
-      </w:r>
-      <w:r>
-        <w:tab/>
-      </w:r>
-      <w:r>
-        <w:t xml:space="preserve"> </w:t>
       </w:r>
     </w:p>
     <w:p>
@@ -9352,76 +9074,60 @@
       </w:r>
     </w:p>
     <w:p>
+      <w:pPr>
+        <w:spacing w:after="360"/>
+      </w:pPr>
+      <w:r>
+        <w:t>Datum: …………………………...</w:t>
+      </w:r>
+    </w:p>
+    <w:p>
       <w:pPr/>
       <w:r>
-        <w:t>Datum: …………………………...</w:t>
+        <w:t xml:space="preserve">Ik </w:t>
+      </w:r>
+      <w:r>
+        <w:t xml:space="preserve">ondergetekende </w:t>
+      </w:r>
+      <w:r>
+        <w:t xml:space="preserve"> _</w:t>
+      </w:r>
+      <w:r>
+        <w:t>_______________________________</w:t>
+      </w:r>
+      <w:r>
+        <w:t xml:space="preserve">_ </w:t>
+      </w:r>
+      <w:r>
+        <w:t>,</w:t>
+      </w:r>
+      <w:r>
+        <w:t xml:space="preserve"> onderzoeker/bevoegde onderzoeksmederwerker, verklaar de benodigde informatie </w:t>
+      </w:r>
+      <w:r>
+        <w:t>inzake</w:t>
+      </w:r>
+      <w:r>
+        <w:t xml:space="preserve"> deze studie mondeling te hebben verstrekt evenals een exemplaar van het informatiedocument aan de deelnemer te hebben verstrekt. </w:t>
       </w:r>
     </w:p>
     <w:p>
       <w:pPr/>
       <w:r>
-        <w:t xml:space="preserve">    </w:t>
-      </w:r>
-      <w:r>
-        <w:t xml:space="preserve"> </w:t>
+        <w:t xml:space="preserve">Ik bevestig dat geen enkele druk op de deelnemer is uitgeoefend om hem/haar te doen toestemmen tot deelname aan de studie en ik ben bereid om op alle eventuele bijkomende vragen te antwoorden. </w:t>
       </w:r>
     </w:p>
     <w:p>
       <w:pPr/>
       <w:r>
-        <w:t xml:space="preserve"> </w:t>
-      </w:r>
-    </w:p>
-    <w:p>
-      <w:pPr/>
-      <w:r>
-        <w:t xml:space="preserve">Ik </w:t>
-      </w:r>
-      <w:r>
-        <w:t xml:space="preserve">ondergetekende </w:t>
-      </w:r>
-      <w:r>
-        <w:t xml:space="preserve"> _</w:t>
-      </w:r>
-      <w:r>
-        <w:t>_______________________________</w:t>
-      </w:r>
-      <w:r>
-        <w:t xml:space="preserve">_ </w:t>
-      </w:r>
-      <w:r>
-        <w:t>,</w:t>
-      </w:r>
-      <w:r>
-        <w:t xml:space="preserve"> onderzoeker/bevoegde onderzoeksmederwerker, verklaar de benodigde informatie </w:t>
+        <w:t xml:space="preserve">Ik bevestig dat ik werk in overeenstemming met de ethische beginselen zoals vermeld in de laatste versie van de "Verklaring van Helsinki", de "Goede klinische praktijk" en de Belgische wet van 7 mei 2004 </w:t>
       </w:r>
       <w:r>
         <w:t>inzake</w:t>
       </w:r>
       <w:r>
-        <w:t xml:space="preserve"> deze studie mondeling te hebben verstrekt evenals een exemplaar van het informatiedocument aan de deelnemer te hebben verstrekt. </w:t>
-      </w:r>
-    </w:p>
-    <w:p>
-      <w:pPr/>
-      <w:r>
-        <w:t xml:space="preserve">Ik bevestig dat geen enkele druk op de deelnemer is uitgeoefend om hem/haar te doen toestemmen tot deelname aan de studie en ik ben bereid om op alle eventuele bijkomende vragen te antwoorden. </w:t>
-      </w:r>
-    </w:p>
-    <w:p>
-      <w:pPr/>
-      <w:r>
-        <w:t xml:space="preserve">Ik bevestig dat ik werk in overeenstemming met de ethische beginselen zoals vermeld in de laatste versie van de "Verklaring van Helsinki", de "Goede klinische praktijk" en de Belgische wet van 7 mei 2004 </w:t>
-      </w:r>
-      <w:r>
-        <w:t>inzake</w:t>
-      </w:r>
-      <w:r>
         <w:t xml:space="preserve"> experimenten op de menselijke persoon. </w:t>
       </w:r>
-    </w:p>
-    <w:p>
-      <w:pPr/>
     </w:p>
     <w:tbl>
       <w:tblPr>
@@ -9458,9 +9164,10 @@
         </w:tc>
       </w:tr>
     </w:tbl>
-    <w:p/>
-    <w:p>
-      <w:pPr/>
+    <w:p>
+      <w:pPr>
+        <w:spacing w:after="240"/>
+      </w:pPr>
       <w:r>
         <w:rPr>
           <w:b/>
@@ -9481,10 +9188,9 @@
       </w:r>
     </w:p>
     <w:p>
-      <w:pPr/>
-    </w:p>
-    <w:p>
-      <w:pPr/>
+      <w:pPr>
+        <w:spacing w:after="360"/>
+      </w:pPr>
       <w:r>
         <w:rPr>
           <w:b/>
@@ -9524,219 +9230,214 @@
     </w:p>
     <w:p>
       <w:pPr/>
+      <w:r>
+        <w:t>Ik verklaar dat ik geïnformeerd ben over de aard, het doel, de duur</w:t>
+      </w:r>
+      <w:r>
+        <w:t>,</w:t>
+      </w:r>
+      <w:r>
+        <w:t xml:space="preserve"> de eventuele </w:t>
+      </w:r>
+      <w:r>
+        <w:t>voordelen</w:t>
+      </w:r>
+      <w:r>
+        <w:t xml:space="preserve"> en risico’s van de studie en dat ik weet wat van mij wordt verwacht. </w:t>
+      </w:r>
     </w:p>
     <w:p>
       <w:pPr/>
+      <w:r>
+        <w:t xml:space="preserve">Ik heb </w:t>
+      </w:r>
+      <w:r>
+        <w:t>kennis genomen</w:t>
+      </w:r>
+      <w:r>
+        <w:t xml:space="preserve"> van het informatiedocument en de bijlagen ervan.</w:t>
+      </w:r>
     </w:p>
     <w:p>
       <w:pPr/>
       <w:r>
-        <w:t>Ik verklaar dat ik geïnformeerd ben over de aard, het doel, de duur</w:t>
-      </w:r>
-      <w:r>
-        <w:t>,</w:t>
-      </w:r>
-      <w:r>
-        <w:t xml:space="preserve"> de eventuele </w:t>
-      </w:r>
-      <w:r>
-        <w:t>voordelen</w:t>
-      </w:r>
-      <w:r>
-        <w:t xml:space="preserve"> en risico’s van de studie en dat ik weet wat van mij wordt verwacht. </w:t>
+        <w:t xml:space="preserve">Ik heb voldoende tijd gehad om na te denken en met een door mij gekozen persoon, </w:t>
+      </w:r>
+      <w:r>
+        <w:t xml:space="preserve">bijvoorbeeld een </w:t>
+      </w:r>
+      <w:r>
+        <w:t>familielid, te praten.</w:t>
       </w:r>
     </w:p>
     <w:p>
       <w:pPr/>
       <w:r>
-        <w:t xml:space="preserve">Ik heb </w:t>
-      </w:r>
-      <w:r>
-        <w:t>kennis genomen</w:t>
-      </w:r>
-      <w:r>
-        <w:t xml:space="preserve"> van het informatiedocument en de bijlagen ervan.</w:t>
+        <w:t>Ik heb alle vragen kunnen stellen die bij me opkwamen en ik heb een duidelijk antwoord gekregen op mijn vragen.</w:t>
       </w:r>
     </w:p>
     <w:p>
       <w:pPr/>
       <w:r>
-        <w:t xml:space="preserve">Ik heb voldoende tijd gehad om na te denken en met een door mij gekozen persoon, </w:t>
-      </w:r>
-      <w:r>
-        <w:t xml:space="preserve">bijvoorbeeld een </w:t>
-      </w:r>
-      <w:r>
-        <w:t>familielid, te praten.</w:t>
+        <w:t xml:space="preserve">Ik begrijp dat mijn deelname aan deze studie vrijwillig is en dat ik vrij ben mijn deelname aan deze studie stop te zetten zonder dat dit mijn relatie schaadt met </w:t>
+      </w:r>
+      <w:r>
+        <w:t>mijn leidinggevende</w:t>
+      </w:r>
+      <w:r>
+        <w:t xml:space="preserve"> d</w:t>
+      </w:r>
+      <w:r>
+        <w:t>ie</w:t>
+      </w:r>
+      <w:r>
+        <w:t xml:space="preserve"> instaat voor mijn </w:t>
+      </w:r>
+      <w:r>
+        <w:t>werk</w:t>
+      </w:r>
+      <w:r>
+        <w:t>.</w:t>
       </w:r>
     </w:p>
     <w:p>
       <w:pPr/>
       <w:r>
-        <w:t>Ik heb alle vragen kunnen stellen die bij me opkwamen en ik heb een duidelijk antwoord gekregen op mijn vragen.</w:t>
+        <w:t xml:space="preserve">Ik begrijp dat er tijdens mijn deelname aan </w:t>
+      </w:r>
+      <w:r>
+        <w:t>deze</w:t>
+      </w:r>
+      <w:r>
+        <w:t xml:space="preserve"> studie gegevens over mij zullen worden verzameld en dat </w:t>
+      </w:r>
+      <w:r>
+        <w:t>de arts-onderzoeker en de opdrachtgever de vertrouwelijkheid van deze gegevens verzekeren overeenkomstig de Europese en Belgische</w:t>
+      </w:r>
+      <w:r>
+        <w:t xml:space="preserve"> wetgeving ter zake.</w:t>
+      </w:r>
+      <w:r>
+        <w:t xml:space="preserve"> Ik begrijp dat </w:t>
+      </w:r>
+      <w:r>
+        <w:t xml:space="preserve">het uitvoeren van deze studie door KU Leuven het algemeen belang dient en </w:t>
+      </w:r>
+      <w:r>
+        <w:t xml:space="preserve">de verwerking </w:t>
+      </w:r>
+      <w:r>
+        <w:t xml:space="preserve">van mijn persoonsgegevens noodzakelijk is </w:t>
+      </w:r>
+      <w:r>
+        <w:t xml:space="preserve">voor het uitvoeren van </w:t>
+      </w:r>
+      <w:r>
+        <w:t>deze studie.</w:t>
+      </w:r>
+      <w:r>
+        <w:t xml:space="preserve"> </w:t>
       </w:r>
     </w:p>
     <w:p>
       <w:pPr/>
       <w:r>
-        <w:t xml:space="preserve">Ik begrijp dat mijn deelname aan deze studie vrijwillig is en dat ik vrij ben mijn deelname aan deze studie stop te zetten zonder dat dit mijn relatie schaadt met </w:t>
-      </w:r>
-      <w:r>
-        <w:t>mijn leidinggevende</w:t>
-      </w:r>
-      <w:r>
-        <w:t xml:space="preserve"> d</w:t>
-      </w:r>
-      <w:r>
-        <w:t>ie</w:t>
-      </w:r>
-      <w:r>
-        <w:t xml:space="preserve"> instaat voor mijn </w:t>
-      </w:r>
-      <w:r>
-        <w:t>werk</w:t>
+        <w:t xml:space="preserve">Ik begrijp dat deze </w:t>
+      </w:r>
+      <w:r>
+        <w:t xml:space="preserve">studie deel uitmaakt van een gezamenlijk project tussen KU Leuven, VUB en </w:t>
+      </w:r>
+      <w:r>
+        <w:t>zes diabetesvoetklinieken (</w:t>
+      </w:r>
+      <w:r>
+        <w:t>UZGent</w:t>
+      </w:r>
+      <w:r>
+        <w:t xml:space="preserve">, </w:t>
+      </w:r>
+      <w:r>
+        <w:t>UZAntwerpen</w:t>
+      </w:r>
+      <w:r>
+        <w:t xml:space="preserve">, AZ </w:t>
+      </w:r>
+      <w:r>
+        <w:t>Groeninge</w:t>
+      </w:r>
+      <w:r>
+        <w:t xml:space="preserve">, AZ Sint-Jan, </w:t>
+      </w:r>
+      <w:r>
+        <w:t>Azorg</w:t>
+      </w:r>
+      <w:r>
+        <w:t xml:space="preserve">, </w:t>
+      </w:r>
+      <w:r>
+        <w:t>UZLeuven</w:t>
+      </w:r>
+      <w:r>
+        <w:t xml:space="preserve">). De </w:t>
+      </w:r>
+      <w:r>
+        <w:t xml:space="preserve">studiegegevens </w:t>
+      </w:r>
+      <w:r>
+        <w:t xml:space="preserve">zullen </w:t>
+      </w:r>
+      <w:r>
+        <w:t>vertrouwelijk tussen de drie project partners gedeeld worden om het welslagen van dit project mogelijk te maken.</w:t>
+      </w:r>
+      <w:r>
+        <w:t xml:space="preserve"> </w:t>
+      </w:r>
+    </w:p>
+    <w:p>
+      <w:pPr/>
+      <w:r>
+        <w:t xml:space="preserve">Ik geef toestemming dat er in het kader van deze klinische studie een geluidsopname wordt gemaakt van het interview om later door de onderzoeker uitgeschreven te worden. Nadat het interview is uitgeschreven wordt de geluidsopname onmiddellijk verwijderd. Deze gegevens zullen enkel in groep gerapporteerd worden en nooit individueel. Deze data </w:t>
+      </w:r>
+      <w:r>
+        <w:t>wordt</w:t>
+      </w:r>
+      <w:r>
+        <w:t xml:space="preserve"> volledig vertrouwelijk behandeld.</w:t>
+      </w:r>
+    </w:p>
+    <w:p>
+      <w:pPr/>
+      <w:r>
+        <w:t>Ik geef toestemming dat er in het kader van deze klinische studies video-opnames, waarin ik herkenbaar ben, worden gemaakt mijn klinische interventie die ik geef aan de patiënt. Na analyse worden deze video-opnames onmiddellijk verwijderd. Deze gegevens zullen enkel in groep gerapporteerd worden en nooit individueel. Deze data worden volledig vertrouwelijk behandeld.</w:t>
+      </w:r>
+    </w:p>
+    <w:p>
+      <w:pPr/>
+      <w:r>
+        <w:t xml:space="preserve">Ik geef toestemming dat de data die voortvloeit uit mijn deelname aan de studie, mag gebruikt worden in andere, toekomstige, wetenschappelijke studies van de </w:t>
+      </w:r>
+      <w:r>
+        <w:t>voormelde</w:t>
+      </w:r>
+      <w:r>
+        <w:t xml:space="preserve"> project partners</w:t>
       </w:r>
       <w:r>
         <w:t>.</w:t>
       </w:r>
     </w:p>
     <w:p>
-      <w:pPr/>
-      <w:r>
-        <w:t xml:space="preserve">Ik begrijp dat er tijdens mijn deelname aan </w:t>
-      </w:r>
-      <w:r>
-        <w:t>deze</w:t>
-      </w:r>
-      <w:r>
-        <w:t xml:space="preserve"> studie gegevens over mij zullen worden verzameld en dat </w:t>
-      </w:r>
-      <w:r>
-        <w:t>de arts-onderzoeker en de opdrachtgever de vertrouwelijkheid van deze gegevens verzekeren overeenkomstig de Europese en Belgische</w:t>
-      </w:r>
-      <w:r>
-        <w:t xml:space="preserve"> wetgeving ter zake.</w:t>
-      </w:r>
-      <w:r>
-        <w:t xml:space="preserve"> Ik begrijp dat </w:t>
-      </w:r>
-      <w:r>
-        <w:t xml:space="preserve">het uitvoeren van deze studie door KU Leuven het algemeen belang dient en </w:t>
-      </w:r>
-      <w:r>
-        <w:t xml:space="preserve">de verwerking </w:t>
-      </w:r>
-      <w:r>
-        <w:t xml:space="preserve">van mijn persoonsgegevens noodzakelijk is </w:t>
-      </w:r>
-      <w:r>
-        <w:t xml:space="preserve">voor het uitvoeren van </w:t>
-      </w:r>
-      <w:r>
-        <w:t>deze studie.</w:t>
-      </w:r>
-      <w:r>
-        <w:t xml:space="preserve"> </w:t>
-      </w:r>
-    </w:p>
-    <w:p>
-      <w:pPr/>
-      <w:r>
-        <w:t xml:space="preserve">Ik begrijp dat deze </w:t>
-      </w:r>
-      <w:r>
-        <w:t xml:space="preserve">studie deel uitmaakt van een gezamenlijk project tussen KU Leuven, VUB en </w:t>
-      </w:r>
-      <w:r>
-        <w:t>zes diabetesvoetklinieken (</w:t>
-      </w:r>
-      <w:r>
-        <w:t>UZGent</w:t>
-      </w:r>
-      <w:r>
-        <w:t xml:space="preserve">, </w:t>
-      </w:r>
-      <w:r>
-        <w:t>UZAntwerpen</w:t>
-      </w:r>
-      <w:r>
-        <w:t xml:space="preserve">, AZ </w:t>
-      </w:r>
-      <w:r>
-        <w:t>Groeninge</w:t>
-      </w:r>
-      <w:r>
-        <w:t xml:space="preserve">, AZ Sint-Jan, </w:t>
-      </w:r>
-      <w:r>
-        <w:t>Azorg</w:t>
-      </w:r>
-      <w:r>
-        <w:t xml:space="preserve">, </w:t>
-      </w:r>
-      <w:r>
-        <w:t>UZLeuven</w:t>
-      </w:r>
-      <w:r>
-        <w:t xml:space="preserve">). De </w:t>
-      </w:r>
-      <w:r>
-        <w:t xml:space="preserve">studiegegevens </w:t>
-      </w:r>
-      <w:r>
-        <w:t xml:space="preserve">zullen </w:t>
-      </w:r>
-      <w:r>
-        <w:t>vertrouwelijk tussen de drie project partners gedeeld worden om het welslagen van dit project mogelijk te maken.</w:t>
-      </w:r>
-      <w:r>
-        <w:t xml:space="preserve"> </w:t>
-      </w:r>
-    </w:p>
-    <w:p>
-      <w:pPr/>
-      <w:r>
-        <w:t xml:space="preserve">Ik geef toestemming dat er in het kader van deze klinische studie een geluidsopname wordt gemaakt van het interview om later door de onderzoeker uitgeschreven te worden. Nadat het interview is uitgeschreven wordt de geluidsopname onmiddellijk verwijderd. Deze gegevens zullen enkel in groep gerapporteerd worden en nooit individueel. Deze data </w:t>
-      </w:r>
-      <w:r>
-        <w:t>wordt</w:t>
-      </w:r>
-      <w:r>
-        <w:t xml:space="preserve"> volledig vertrouwelijk behandeld.</w:t>
-      </w:r>
-    </w:p>
-    <w:p>
-      <w:pPr/>
-      <w:r>
-        <w:t>Ik geef toestemming dat er in het kader van deze klinische studies video-opnames, waarin ik herkenbaar ben, worden gemaakt mijn klinische interventie die ik geef aan de patiënt. Na analyse worden deze video-opnames onmiddellijk verwijderd. Deze gegevens zullen enkel in groep gerapporteerd worden en nooit individueel. Deze data worden volledig vertrouwelijk behandeld.</w:t>
-      </w:r>
-    </w:p>
-    <w:p>
-      <w:pPr/>
-      <w:r>
-        <w:t xml:space="preserve">Ik geef toestemming dat de data die voortvloeit uit mijn deelname aan de studie, mag gebruikt worden in andere, toekomstige, wetenschappelijke studies van de </w:t>
-      </w:r>
-      <w:r>
-        <w:t>voormelde</w:t>
-      </w:r>
-      <w:r>
-        <w:t xml:space="preserve"> project partners</w:t>
-      </w:r>
-      <w:r>
-        <w:t>.</w:t>
-      </w:r>
-    </w:p>
-    <w:p>
-      <w:pPr/>
+      <w:pPr>
+        <w:spacing w:after="240"/>
+      </w:pPr>
       <w:r>
         <w:t>Ik heb een exemplaar ontvangen van de informatie aan de deelnemer en de geïnformeerde toestemming.</w:t>
       </w:r>
     </w:p>
     <w:p>
-      <w:pPr/>
-    </w:p>
-    <w:p>
-      <w:pPr/>
+      <w:pPr>
+        <w:spacing w:after="480"/>
+      </w:pPr>
       <w:r>
         <w:t>Naam</w:t>
       </w:r>
@@ -9754,19 +9455,9 @@
       </w:r>
     </w:p>
     <w:p>
-      <w:pPr/>
-    </w:p>
-    <w:p>
-      <w:pPr/>
-    </w:p>
-    <w:p>
-      <w:pPr/>
-    </w:p>
-    <w:p>
-      <w:pPr/>
-    </w:p>
-    <w:p>
-      <w:pPr/>
+      <w:pPr>
+        <w:spacing w:after="480"/>
+      </w:pPr>
       <w:r>
         <w:t>D</w:t>
       </w:r>
@@ -9778,63 +9469,14 @@
       </w:r>
     </w:p>
     <w:p>
-      <w:pPr/>
-    </w:p>
-    <w:p>
-      <w:pPr/>
-    </w:p>
-    <w:p>
-      <w:pPr/>
-    </w:p>
-    <w:p>
-      <w:pPr/>
-    </w:p>
-    <w:p>
-      <w:pPr/>
+      <w:pPr>
+        <w:spacing w:after="480"/>
+      </w:pPr>
       <w:r>
         <w:t>H</w:t>
       </w:r>
       <w:r>
         <w:t>andtekening van de deelnemer</w:t>
-      </w:r>
-    </w:p>
-    <w:p>
-      <w:pPr/>
-    </w:p>
-    <w:p>
-      <w:pPr/>
-    </w:p>
-    <w:p>
-      <w:pPr/>
-    </w:p>
-    <w:p>
-      <w:pPr/>
-    </w:p>
-    <w:p>
-      <w:pPr/>
-    </w:p>
-    <w:p>
-      <w:pPr/>
-      <w:r>
-        <w:t xml:space="preserve"> </w:t>
-      </w:r>
-      <w:r>
-        <w:tab/>
-      </w:r>
-      <w:r>
-        <w:tab/>
-      </w:r>
-      <w:r>
-        <w:tab/>
-      </w:r>
-      <w:r>
-        <w:tab/>
-      </w:r>
-      <w:r>
-        <w:tab/>
-      </w:r>
-      <w:r>
-        <w:t xml:space="preserve"> </w:t>
       </w:r>
     </w:p>
     <w:p>
@@ -9859,70 +9501,54 @@
       </w:r>
     </w:p>
     <w:p>
+      <w:pPr>
+        <w:spacing w:after="360"/>
+      </w:pPr>
+      <w:r>
+        <w:t>Datum: …………………………...</w:t>
+      </w:r>
+    </w:p>
+    <w:p>
       <w:pPr/>
       <w:r>
-        <w:t>Datum: …………………………...</w:t>
+        <w:t xml:space="preserve">Ik </w:t>
+      </w:r>
+      <w:r>
+        <w:t>ondergetekende  _</w:t>
+      </w:r>
+      <w:r>
+        <w:t>_______________________________</w:t>
+      </w:r>
+      <w:r>
+        <w:t>_ ,</w:t>
+      </w:r>
+      <w:r>
+        <w:t xml:space="preserve"> onderzoeker/bevoegde onderzoeksmederwerker, verklaar de benodigde informatie </w:t>
+      </w:r>
+      <w:r>
+        <w:t>inzake</w:t>
+      </w:r>
+      <w:r>
+        <w:t xml:space="preserve"> deze studie mondeling te hebben verstrekt evenals een exemplaar van het informatiedocument aan de deelnemer te hebben verstrekt. </w:t>
       </w:r>
     </w:p>
     <w:p>
       <w:pPr/>
       <w:r>
-        <w:t xml:space="preserve">    </w:t>
-      </w:r>
-      <w:r>
-        <w:t xml:space="preserve"> </w:t>
+        <w:t xml:space="preserve">Ik bevestig dat geen enkele druk op de deelnemer is uitgeoefend om hem/haar te doen toestemmen tot deelname aan de studie en ik ben bereid om op alle eventuele bijkomende vragen te antwoorden. </w:t>
       </w:r>
     </w:p>
     <w:p>
       <w:pPr/>
       <w:r>
-        <w:t xml:space="preserve"> </w:t>
-      </w:r>
-    </w:p>
-    <w:p>
-      <w:pPr/>
-      <w:r>
-        <w:t xml:space="preserve">Ik </w:t>
-      </w:r>
-      <w:r>
-        <w:t>ondergetekende  _</w:t>
-      </w:r>
-      <w:r>
-        <w:t>_______________________________</w:t>
-      </w:r>
-      <w:r>
-        <w:t>_ ,</w:t>
-      </w:r>
-      <w:r>
-        <w:t xml:space="preserve"> onderzoeker/bevoegde onderzoeksmederwerker, verklaar de benodigde informatie </w:t>
+        <w:t xml:space="preserve">Ik bevestig dat ik werk in overeenstemming met de ethische beginselen zoals vermeld in de laatste versie van de "Verklaring van Helsinki", de "Goede klinische praktijk" en de Belgische wet van 7 mei 2004 </w:t>
       </w:r>
       <w:r>
         <w:t>inzake</w:t>
       </w:r>
       <w:r>
-        <w:t xml:space="preserve"> deze studie mondeling te hebben verstrekt evenals een exemplaar van het informatiedocument aan de deelnemer te hebben verstrekt. </w:t>
-      </w:r>
-    </w:p>
-    <w:p>
-      <w:pPr/>
-      <w:r>
-        <w:t xml:space="preserve">Ik bevestig dat geen enkele druk op de deelnemer is uitgeoefend om hem/haar te doen toestemmen tot deelname aan de studie en ik ben bereid om op alle eventuele bijkomende vragen te antwoorden. </w:t>
-      </w:r>
-    </w:p>
-    <w:p>
-      <w:pPr/>
-      <w:r>
-        <w:t xml:space="preserve">Ik bevestig dat ik werk in overeenstemming met de ethische beginselen zoals vermeld in de laatste versie van de "Verklaring van Helsinki", de "Goede klinische praktijk" en de Belgische wet van 7 mei 2004 </w:t>
-      </w:r>
-      <w:r>
-        <w:t>inzake</w:t>
-      </w:r>
-      <w:r>
         <w:t xml:space="preserve"> experimenten op de menselijke persoon. </w:t>
       </w:r>
-    </w:p>
-    <w:p>
-      <w:pPr/>
     </w:p>
     <w:tbl>
       <w:tblPr>
@@ -9959,22 +9585,6 @@
         </w:tc>
       </w:tr>
     </w:tbl>
-    <w:p/>
-    <w:p>
-      <w:pPr/>
-    </w:p>
-    <w:p>
-      <w:pPr/>
-    </w:p>
-    <w:p>
-      <w:pPr/>
-      <w:r>
-        <w:rPr>
-          <w:b/>
-        </w:rPr>
-        <w:br/>
-      </w:r>
-    </w:p>
     <w:p>
       <w:pPr/>
       <w:r>
@@ -10448,26 +10058,25 @@
       </w:r>
     </w:p>
     <w:p>
+      <w:pPr>
+        <w:spacing w:after="240"/>
+      </w:pPr>
+      <w:r>
+        <w:t>Indien</w:t>
+      </w:r>
+      <w:r>
+        <w:t xml:space="preserve"> u uw toestemming tot deelname aan de studie intrekt, zullen de gecodeerde gegevens die al verzameld waren vóór uw terugtrekking, bewaard worden. </w:t>
+      </w:r>
+      <w:r>
+        <w:t xml:space="preserve">Hierdoor wordt de geldigheid van de studie gegarandeerd. Er zal geen enkel nieuw gegeven aan de opdrachtgever worden doorgegeven. </w:t>
+      </w:r>
+    </w:p>
+    <w:p>
       <w:pPr/>
       <w:r>
         <w:t>Indien</w:t>
       </w:r>
       <w:r>
-        <w:t xml:space="preserve"> u uw toestemming tot deelname aan de studie intrekt, zullen de gecodeerde gegevens die al verzameld waren vóór uw terugtrekking, bewaard worden. </w:t>
-      </w:r>
-      <w:r>
-        <w:t xml:space="preserve">Hierdoor wordt de geldigheid van de studie gegarandeerd. Er zal geen enkel nieuw gegeven aan de opdrachtgever worden doorgegeven. </w:t>
-      </w:r>
-    </w:p>
-    <w:p>
-      <w:pPr/>
-    </w:p>
-    <w:p>
-      <w:pPr/>
-      <w:r>
-        <w:t>Indien</w:t>
-      </w:r>
-      <w:r>
         <w:t xml:space="preserve"> u vragen hebt over hoe wij uw gegevens gebruiken, dan kan u hiervoor steeds terecht bij uw arts-onderzoeker. Ook de functionaris voor gegevensbescherming van het onderzoekcentrum staan </w:t>
       </w:r>
       <w:r>
@@ -10478,7 +10087,9 @@
       </w:r>
     </w:p>
     <w:p>
-      <w:pPr/>
+      <w:pPr>
+        <w:spacing w:after="240"/>
+      </w:pPr>
       <w:r>
         <w:t>De contactgegevens van deze laatste zijn als volgt</w:t>
       </w:r>
@@ -10502,10 +10113,9 @@
       </w:r>
     </w:p>
     <w:p>
-      <w:pPr/>
-    </w:p>
-    <w:p>
-      <w:pPr/>
+      <w:pPr>
+        <w:spacing w:after="240"/>
+      </w:pPr>
       <w:r>
         <w:t xml:space="preserve">Tot slot, </w:t>
       </w:r>
@@ -10515,9 +10125,6 @@
       <w:r>
         <w:t xml:space="preserve"> u een klacht heeft over de verwerking van uw gegevens, kunt u contact opnemen met de Belgische toezichthoudende instantie die toeziet op de naleving van de grondbeginselen van de bescherming van persoonsgegevens:</w:t>
       </w:r>
-    </w:p>
-    <w:p>
-      <w:pPr/>
     </w:p>
     <w:p>
       <w:pPr/>
@@ -10778,20 +10385,8 @@
     </w:p>
     <w:p>
       <w:pPr>
-        <w:pStyle w:val="Heading3"/>
-      </w:pPr>
-    </w:p>
-    <w:p>
-      <w:pPr/>
-    </w:p>
-    <w:p>
-      <w:r>
-        <w:br w:type="page"/>
-      </w:r>
-    </w:p>
-    <w:p>
-      <w:pPr>
         <w:pStyle w:val="Heading1"/>
+        <w:pageBreakBefore/>
       </w:pPr>
       <w:r>
         <w:t>Information and informed consent form for clinic management</w:t>
@@ -11244,7 +10839,9 @@
       </w:hyperlink>
     </w:p>
     <w:p>
-      <w:pPr/>
+      <w:pPr>
+        <w:spacing w:after="240"/>
+      </w:pPr>
       <w:r>
         <w:t xml:space="preserve">Dr. Gertjan Vereecke, AZ </w:t>
       </w:r>
@@ -11268,9 +10865,6 @@
       </w:hyperlink>
     </w:p>
     <w:p>
-      <w:pPr/>
-    </w:p>
-    <w:p>
       <w:pPr>
         <w:pStyle w:val="Heading2"/>
       </w:pPr>
@@ -11290,7 +10884,9 @@
       </w:r>
     </w:p>
     <w:p>
-      <w:pPr/>
+      <w:pPr>
+        <w:spacing w:after="240"/>
+      </w:pPr>
       <w:r>
         <w:t xml:space="preserve">U </w:t>
       </w:r>
@@ -11641,10 +11237,9 @@
       </w:r>
     </w:p>
     <w:p>
-      <w:pPr/>
-    </w:p>
-    <w:p>
-      <w:pPr/>
+      <w:pPr>
+        <w:spacing w:after="240"/>
+      </w:pPr>
       <w:r>
         <w:t>Deze</w:t>
       </w:r>
@@ -11755,10 +11350,9 @@
       </w:r>
     </w:p>
     <w:p>
-      <w:pPr/>
-    </w:p>
-    <w:p>
-      <w:pPr/>
+      <w:pPr>
+        <w:spacing w:after="240"/>
+      </w:pPr>
       <w:r>
         <w:t>Wij vragen u de volgende pagina’s met informatie aandachtig te lezen. Hebt u vragen, dan kan u terecht bij de arts-onderzoeker of zijn of haar vertegenwoordiger</w:t>
       </w:r>
@@ -11768,9 +11362,6 @@
       <w:r>
         <w:t xml:space="preserve"> Dit document bestaat uit 3 delen: essentiële informatie die u nodig heeft voor het nemen van uw beslissing, uw schriftelijke toestemming en bijlagen waarin u meer details terugvindt over bepaalde onderdelen van de basisinformatie.</w:t>
       </w:r>
-    </w:p>
-    <w:p>
-      <w:pPr/>
     </w:p>
     <w:p>
       <w:pPr/>
@@ -11830,6 +11421,7 @@
     <w:p>
       <w:pPr>
         <w:pStyle w:val="ListBullet"/>
+        <w:spacing w:after="240"/>
       </w:pPr>
       <w:r>
         <w:t>De gegevens die in het kader van de deelname worden verzameld, zijn vertrouwelijk. Bij de publicatie van de resultaten is de anonimiteit verzekerd.</w:t>
@@ -11842,13 +11434,23 @@
       <w:pPr>
         <w:pStyle w:val="ListBullet"/>
       </w:pPr>
+      <w:r>
+        <w:t>Er een verzekering is afgesloten voor het geval dat u schade zou oplopen in het kader van uw deelname aan deze klinische studie.</w:t>
+      </w:r>
+      <w:r>
+        <w:t xml:space="preserve"> </w:t>
+      </w:r>
     </w:p>
     <w:p>
       <w:pPr>
         <w:pStyle w:val="ListBullet"/>
+        <w:spacing w:after="240"/>
       </w:pPr>
       <w:r>
-        <w:t>Er een verzekering is afgesloten voor het geval dat u schade zou oplopen in het kader van uw deelname aan deze klinische studie.</w:t>
+        <w:t>Indien</w:t>
+      </w:r>
+      <w:r>
+        <w:t xml:space="preserve"> u extra informatie wenst, u altijd contact kunt opnemen met de onderzoeker of een medewerker van zijn team.</w:t>
       </w:r>
       <w:r>
         <w:t xml:space="preserve"> </w:t>
@@ -11856,13 +11458,16 @@
     </w:p>
     <w:p>
       <w:pPr>
-        <w:pStyle w:val="ListBullet"/>
+        <w:spacing w:after="240"/>
       </w:pPr>
       <w:r>
-        <w:t>Indien</w:t>
-      </w:r>
-      <w:r>
-        <w:t xml:space="preserve"> u extra informatie wenst, u altijd contact kunt opnemen met de onderzoeker of een medewerker van zijn team.</w:t>
+        <w:t xml:space="preserve">Alvast bedankt voor uw </w:t>
+      </w:r>
+      <w:r>
+        <w:t xml:space="preserve">tijd en </w:t>
+      </w:r>
+      <w:r>
+        <w:t>interesse.</w:t>
       </w:r>
       <w:r>
         <w:t xml:space="preserve"> </w:t>
@@ -11871,41 +11476,11 @@
     <w:p>
       <w:pPr/>
       <w:r>
+        <w:t>Hoogachtend,</w:t>
+      </w:r>
+      <w:r>
         <w:t xml:space="preserve"> </w:t>
       </w:r>
-    </w:p>
-    <w:p>
-      <w:pPr/>
-      <w:r>
-        <w:t xml:space="preserve">Alvast bedankt voor uw </w:t>
-      </w:r>
-      <w:r>
-        <w:t xml:space="preserve">tijd en </w:t>
-      </w:r>
-      <w:r>
-        <w:t>interesse.</w:t>
-      </w:r>
-      <w:r>
-        <w:t xml:space="preserve"> </w:t>
-      </w:r>
-    </w:p>
-    <w:p>
-      <w:pPr/>
-      <w:r>
-        <w:t xml:space="preserve"> </w:t>
-      </w:r>
-    </w:p>
-    <w:p>
-      <w:pPr/>
-      <w:r>
-        <w:t>Hoogachtend,</w:t>
-      </w:r>
-      <w:r>
-        <w:t xml:space="preserve"> </w:t>
-      </w:r>
-    </w:p>
-    <w:p>
-      <w:pPr/>
     </w:p>
     <w:tbl>
       <w:tblPr>
@@ -11940,22 +11515,10 @@
         </w:tc>
       </w:tr>
     </w:tbl>
-    <w:p/>
-    <w:p>
-      <w:pPr/>
-    </w:p>
-    <w:p>
-      <w:pPr/>
-    </w:p>
-    <w:p>
-      <w:pPr/>
-    </w:p>
-    <w:p>
-      <w:pPr/>
-    </w:p>
     <w:p>
       <w:pPr>
         <w:pStyle w:val="Heading3"/>
+        <w:spacing w:after="240"/>
       </w:pPr>
       <w:r>
         <w:t xml:space="preserve">3. </w:t>
@@ -11972,9 +11535,6 @@
       <w:r>
         <w:t xml:space="preserve"> van de studie</w:t>
       </w:r>
-    </w:p>
-    <w:p>
-      <w:pPr/>
     </w:p>
     <w:p>
       <w:pPr/>
@@ -13899,7 +13459,9 @@
       </w:r>
     </w:p>
     <w:p>
-      <w:pPr/>
+      <w:pPr>
+        <w:spacing w:after="240"/>
+      </w:pPr>
       <w:r>
         <w:rPr>
           <w:b/>
@@ -13909,9 +13471,6 @@
     </w:p>
     <w:p>
       <w:pPr/>
-    </w:p>
-    <w:p>
-      <w:pPr/>
       <w:r>
         <w:t xml:space="preserve">Als u bijkomende informatie wenst, maar ook ingeval van problemen of als u zich zorgen maakt, kan u contact opnemen met de </w:t>
       </w:r>
@@ -14009,17 +13568,16 @@
       </w:r>
     </w:p>
     <w:p>
+      <w:pPr>
+        <w:spacing w:after="240"/>
+      </w:pPr>
+      <w:r>
+        <w:t xml:space="preserve">Uw deelname is vrijwillig. U hebt het recht om uw deelname aan de studie om eender welke reden en zonder opgave van redenen stop te zetten. </w:t>
+      </w:r>
+    </w:p>
+    <w:p>
       <w:pPr/>
       <w:r>
-        <w:t xml:space="preserve">Uw deelname is vrijwillig. U hebt het recht om uw deelname aan de studie om eender welke reden en zonder opgave van redenen stop te zetten. </w:t>
-      </w:r>
-    </w:p>
-    <w:p>
-      <w:pPr/>
-    </w:p>
-    <w:p>
-      <w:pPr/>
-      <w:r>
         <w:t>Ook gebeurt het soms dat de bevoegde nationale of internationale autoriteiten, de ethische comités die aanvankelijk goedkeuring had</w:t>
       </w:r>
       <w:r>
@@ -14048,7 +13606,9 @@
       </w:r>
     </w:p>
     <w:p>
-      <w:pPr/>
+      <w:pPr>
+        <w:spacing w:after="360"/>
+      </w:pPr>
       <w:r>
         <w:t xml:space="preserve">Deelname aan dit onderzoek zal voor u geen </w:t>
       </w:r>
@@ -14066,16 +13626,9 @@
       </w:r>
     </w:p>
     <w:p>
-      <w:pPr/>
-    </w:p>
-    <w:p>
-      <w:pPr/>
-      <w:r>
-        <w:br/>
-      </w:r>
-    </w:p>
-    <w:p>
-      <w:pPr/>
+      <w:pPr>
+        <w:spacing w:after="240"/>
+      </w:pPr>
       <w:r>
         <w:rPr>
           <w:b/>
@@ -14090,10 +13643,9 @@
       </w:r>
     </w:p>
     <w:p>
-      <w:pPr/>
-    </w:p>
-    <w:p>
-      <w:pPr/>
+      <w:pPr>
+        <w:spacing w:after="360"/>
+      </w:pPr>
       <w:r>
         <w:rPr>
           <w:b/>
@@ -14133,219 +13685,214 @@
     </w:p>
     <w:p>
       <w:pPr/>
+      <w:r>
+        <w:t>Ik verklaar dat ik geïnformeerd ben over de aard, het doel, de duur</w:t>
+      </w:r>
+      <w:r>
+        <w:t>,</w:t>
+      </w:r>
+      <w:r>
+        <w:t xml:space="preserve"> de eventuele </w:t>
+      </w:r>
+      <w:r>
+        <w:t>voordelen</w:t>
+      </w:r>
+      <w:r>
+        <w:t xml:space="preserve"> en risico’s van de studie en dat ik weet wat van mij wordt verwacht. </w:t>
+      </w:r>
     </w:p>
     <w:p>
       <w:pPr/>
+      <w:r>
+        <w:t xml:space="preserve">Ik heb </w:t>
+      </w:r>
+      <w:r>
+        <w:t>kennisgenomen</w:t>
+      </w:r>
+      <w:r>
+        <w:t xml:space="preserve"> van het informatiedocument en de bijlagen ervan.</w:t>
+      </w:r>
     </w:p>
     <w:p>
       <w:pPr/>
       <w:r>
-        <w:t>Ik verklaar dat ik geïnformeerd ben over de aard, het doel, de duur</w:t>
-      </w:r>
-      <w:r>
-        <w:t>,</w:t>
-      </w:r>
-      <w:r>
-        <w:t xml:space="preserve"> de eventuele </w:t>
-      </w:r>
-      <w:r>
-        <w:t>voordelen</w:t>
-      </w:r>
-      <w:r>
-        <w:t xml:space="preserve"> en risico’s van de studie en dat ik weet wat van mij wordt verwacht. </w:t>
+        <w:t xml:space="preserve">Ik heb voldoende tijd gehad om na te denken en met een door mij gekozen persoon, </w:t>
+      </w:r>
+      <w:r>
+        <w:t xml:space="preserve">bijvoorbeeld een </w:t>
+      </w:r>
+      <w:r>
+        <w:t xml:space="preserve">personeelslid van de diabetesvoetkliniek of </w:t>
+      </w:r>
+      <w:r>
+        <w:t>collega manager</w:t>
+      </w:r>
+      <w:r>
+        <w:t>, te praten.</w:t>
       </w:r>
     </w:p>
     <w:p>
       <w:pPr/>
       <w:r>
-        <w:t xml:space="preserve">Ik heb </w:t>
-      </w:r>
-      <w:r>
-        <w:t>kennisgenomen</w:t>
-      </w:r>
-      <w:r>
-        <w:t xml:space="preserve"> van het informatiedocument en de bijlagen ervan.</w:t>
+        <w:t>Ik heb alle vragen kunnen stellen die bij me opkwamen en ik heb een duidelijk antwoord gekregen op mijn vragen.</w:t>
       </w:r>
     </w:p>
     <w:p>
       <w:pPr/>
       <w:r>
-        <w:t xml:space="preserve">Ik heb voldoende tijd gehad om na te denken en met een door mij gekozen persoon, </w:t>
-      </w:r>
-      <w:r>
-        <w:t xml:space="preserve">bijvoorbeeld een </w:t>
-      </w:r>
-      <w:r>
-        <w:t xml:space="preserve">personeelslid van de diabetesvoetkliniek of </w:t>
-      </w:r>
-      <w:r>
-        <w:t>collega manager</w:t>
-      </w:r>
-      <w:r>
-        <w:t>, te praten.</w:t>
+        <w:t xml:space="preserve">Ik begrijp dat mijn deelname aan deze studie vrijwillig is en dat ik vrij ben mijn deelname aan deze studie stop te zetten zonder dat dit mijn relatie schaadt met </w:t>
+      </w:r>
+      <w:r>
+        <w:t>mijn leidinggevende</w:t>
+      </w:r>
+      <w:r>
+        <w:t xml:space="preserve"> en/of personeelsleden van de diabetesvoetkliniek</w:t>
+      </w:r>
+      <w:r>
+        <w:t>.</w:t>
       </w:r>
     </w:p>
     <w:p>
       <w:pPr/>
       <w:r>
-        <w:t>Ik heb alle vragen kunnen stellen die bij me opkwamen en ik heb een duidelijk antwoord gekregen op mijn vragen.</w:t>
+        <w:t xml:space="preserve">Ik begrijp dat er tijdens mijn deelname aan </w:t>
+      </w:r>
+      <w:r>
+        <w:t>deze</w:t>
+      </w:r>
+      <w:r>
+        <w:t xml:space="preserve"> studie gegevens over mij zullen worden verzameld en dat </w:t>
+      </w:r>
+      <w:r>
+        <w:t>de arts-onderzoeker en de opdrachtgever de vertrouwelijkheid van deze gegevens verzekeren overeenkomstig de Europese en Belgische</w:t>
+      </w:r>
+      <w:r>
+        <w:t xml:space="preserve"> wetgeving ter zake.</w:t>
+      </w:r>
+      <w:r>
+        <w:t xml:space="preserve"> Ik begrijp dat </w:t>
+      </w:r>
+      <w:r>
+        <w:t xml:space="preserve">het uitvoeren van deze studie door KU Leuven het algemeen belang dient en </w:t>
+      </w:r>
+      <w:r>
+        <w:t xml:space="preserve">de verwerking </w:t>
+      </w:r>
+      <w:r>
+        <w:t xml:space="preserve">van mijn persoonsgegevens noodzakelijk is </w:t>
+      </w:r>
+      <w:r>
+        <w:t xml:space="preserve">voor het uitvoeren van </w:t>
+      </w:r>
+      <w:r>
+        <w:t>deze studie.</w:t>
+      </w:r>
+      <w:r>
+        <w:t xml:space="preserve"> </w:t>
       </w:r>
     </w:p>
     <w:p>
       <w:pPr/>
       <w:r>
-        <w:t xml:space="preserve">Ik begrijp dat mijn deelname aan deze studie vrijwillig is en dat ik vrij ben mijn deelname aan deze studie stop te zetten zonder dat dit mijn relatie schaadt met </w:t>
-      </w:r>
-      <w:r>
-        <w:t>mijn leidinggevende</w:t>
-      </w:r>
-      <w:r>
-        <w:t xml:space="preserve"> en/of personeelsleden van de diabetesvoetkliniek</w:t>
+        <w:t xml:space="preserve">Ik begrijp dat deze </w:t>
+      </w:r>
+      <w:r>
+        <w:t xml:space="preserve">studie deel uitmaakt van een gezamenlijk project tussen KU Leuven, VUB en </w:t>
+      </w:r>
+      <w:r>
+        <w:t>zes diabetesvoetklinieken (</w:t>
+      </w:r>
+      <w:r>
+        <w:t>UZGent</w:t>
+      </w:r>
+      <w:r>
+        <w:t xml:space="preserve">, </w:t>
+      </w:r>
+      <w:r>
+        <w:t>UZAntwerpen</w:t>
+      </w:r>
+      <w:r>
+        <w:t xml:space="preserve">, AZ </w:t>
+      </w:r>
+      <w:r>
+        <w:t>Groeninge</w:t>
+      </w:r>
+      <w:r>
+        <w:t xml:space="preserve">, AZ Sint-Jan, </w:t>
+      </w:r>
+      <w:r>
+        <w:t>Azorg</w:t>
+      </w:r>
+      <w:r>
+        <w:t xml:space="preserve">, </w:t>
+      </w:r>
+      <w:r>
+        <w:t>UZLeuven</w:t>
+      </w:r>
+      <w:r>
+        <w:t>)</w:t>
+      </w:r>
+      <w:r>
+        <w:t xml:space="preserve">. De </w:t>
+      </w:r>
+      <w:r>
+        <w:t xml:space="preserve">studiegegevens </w:t>
+      </w:r>
+      <w:r>
+        <w:t xml:space="preserve">zullen </w:t>
+      </w:r>
+      <w:r>
+        <w:t>vertrouwelijk tussen de project partners gedeeld worden om het welslagen van dit project mogelijk te maken.</w:t>
+      </w:r>
+      <w:r>
+        <w:t xml:space="preserve"> </w:t>
+      </w:r>
+    </w:p>
+    <w:p>
+      <w:pPr/>
+      <w:r>
+        <w:t xml:space="preserve">Ik geef toestemming dat er in het kader van deze klinische studie een geluidsopname wordt gemaakt van het interview om later door de onderzoeker uitgeschreven te worden. Nadat het interview is uitgeschreven wordt de geluidsopname onmiddellijk verwijderd. Deze gegevens zullen enkel in groep gerapporteerd worden en nooit individueel. Deze data </w:t>
+      </w:r>
+      <w:r>
+        <w:t>worden</w:t>
+      </w:r>
+      <w:r>
+        <w:t xml:space="preserve"> volledig vertrouwelijk behandeld.</w:t>
+      </w:r>
+    </w:p>
+    <w:p>
+      <w:pPr/>
+      <w:r>
+        <w:t>Ik geef toestemming dat de data die voortvloei</w:t>
+      </w:r>
+      <w:r>
+        <w:t>en</w:t>
+      </w:r>
+      <w:r>
+        <w:t xml:space="preserve"> uit mijn deelname aan de studie, mag gebruikt worden in andere, toekomstige, wetenschappelijke studies van de </w:t>
+      </w:r>
+      <w:r>
+        <w:t>voormelde</w:t>
+      </w:r>
+      <w:r>
+        <w:t xml:space="preserve"> project partners</w:t>
       </w:r>
       <w:r>
         <w:t>.</w:t>
       </w:r>
     </w:p>
     <w:p>
-      <w:pPr/>
-      <w:r>
-        <w:t xml:space="preserve">Ik begrijp dat er tijdens mijn deelname aan </w:t>
-      </w:r>
-      <w:r>
-        <w:t>deze</w:t>
-      </w:r>
-      <w:r>
-        <w:t xml:space="preserve"> studie gegevens over mij zullen worden verzameld en dat </w:t>
-      </w:r>
-      <w:r>
-        <w:t>de arts-onderzoeker en de opdrachtgever de vertrouwelijkheid van deze gegevens verzekeren overeenkomstig de Europese en Belgische</w:t>
-      </w:r>
-      <w:r>
-        <w:t xml:space="preserve"> wetgeving ter zake.</w:t>
-      </w:r>
-      <w:r>
-        <w:t xml:space="preserve"> Ik begrijp dat </w:t>
-      </w:r>
-      <w:r>
-        <w:t xml:space="preserve">het uitvoeren van deze studie door KU Leuven het algemeen belang dient en </w:t>
-      </w:r>
-      <w:r>
-        <w:t xml:space="preserve">de verwerking </w:t>
-      </w:r>
-      <w:r>
-        <w:t xml:space="preserve">van mijn persoonsgegevens noodzakelijk is </w:t>
-      </w:r>
-      <w:r>
-        <w:t xml:space="preserve">voor het uitvoeren van </w:t>
-      </w:r>
-      <w:r>
-        <w:t>deze studie.</w:t>
-      </w:r>
-      <w:r>
-        <w:t xml:space="preserve"> </w:t>
-      </w:r>
-    </w:p>
-    <w:p>
-      <w:pPr/>
-      <w:r>
-        <w:t xml:space="preserve">Ik begrijp dat deze </w:t>
-      </w:r>
-      <w:r>
-        <w:t xml:space="preserve">studie deel uitmaakt van een gezamenlijk project tussen KU Leuven, VUB en </w:t>
-      </w:r>
-      <w:r>
-        <w:t>zes diabetesvoetklinieken (</w:t>
-      </w:r>
-      <w:r>
-        <w:t>UZGent</w:t>
-      </w:r>
-      <w:r>
-        <w:t xml:space="preserve">, </w:t>
-      </w:r>
-      <w:r>
-        <w:t>UZAntwerpen</w:t>
-      </w:r>
-      <w:r>
-        <w:t xml:space="preserve">, AZ </w:t>
-      </w:r>
-      <w:r>
-        <w:t>Groeninge</w:t>
-      </w:r>
-      <w:r>
-        <w:t xml:space="preserve">, AZ Sint-Jan, </w:t>
-      </w:r>
-      <w:r>
-        <w:t>Azorg</w:t>
-      </w:r>
-      <w:r>
-        <w:t xml:space="preserve">, </w:t>
-      </w:r>
-      <w:r>
-        <w:t>UZLeuven</w:t>
-      </w:r>
-      <w:r>
-        <w:t>)</w:t>
-      </w:r>
-      <w:r>
-        <w:t xml:space="preserve">. De </w:t>
-      </w:r>
-      <w:r>
-        <w:t xml:space="preserve">studiegegevens </w:t>
-      </w:r>
-      <w:r>
-        <w:t xml:space="preserve">zullen </w:t>
-      </w:r>
-      <w:r>
-        <w:t>vertrouwelijk tussen de project partners gedeeld worden om het welslagen van dit project mogelijk te maken.</w:t>
-      </w:r>
-      <w:r>
-        <w:t xml:space="preserve"> </w:t>
-      </w:r>
-    </w:p>
-    <w:p>
-      <w:pPr/>
-      <w:r>
-        <w:t xml:space="preserve">Ik geef toestemming dat er in het kader van deze klinische studie een geluidsopname wordt gemaakt van het interview om later door de onderzoeker uitgeschreven te worden. Nadat het interview is uitgeschreven wordt de geluidsopname onmiddellijk verwijderd. Deze gegevens zullen enkel in groep gerapporteerd worden en nooit individueel. Deze data </w:t>
-      </w:r>
-      <w:r>
-        <w:t>worden</w:t>
-      </w:r>
-      <w:r>
-        <w:t xml:space="preserve"> volledig vertrouwelijk behandeld.</w:t>
-      </w:r>
-    </w:p>
-    <w:p>
-      <w:pPr/>
-      <w:r>
-        <w:t>Ik geef toestemming dat de data die voortvloei</w:t>
-      </w:r>
-      <w:r>
-        <w:t>en</w:t>
-      </w:r>
-      <w:r>
-        <w:t xml:space="preserve"> uit mijn deelname aan de studie, mag gebruikt worden in andere, toekomstige, wetenschappelijke studies van de </w:t>
-      </w:r>
-      <w:r>
-        <w:t>voormelde</w:t>
-      </w:r>
-      <w:r>
-        <w:t xml:space="preserve"> project partners</w:t>
-      </w:r>
-      <w:r>
-        <w:t>.</w:t>
-      </w:r>
-    </w:p>
-    <w:p>
-      <w:pPr/>
+      <w:pPr>
+        <w:spacing w:after="240"/>
+      </w:pPr>
       <w:r>
         <w:t>Ik heb een exemplaar ontvangen van de informatie aan de deelnemer en de geïnformeerde toestemming.</w:t>
       </w:r>
     </w:p>
     <w:p>
-      <w:pPr/>
-    </w:p>
-    <w:p>
-      <w:pPr/>
+      <w:pPr>
+        <w:spacing w:after="480"/>
+      </w:pPr>
       <w:r>
         <w:t>Naam</w:t>
       </w:r>
@@ -14363,19 +13910,9 @@
       </w:r>
     </w:p>
     <w:p>
-      <w:pPr/>
-    </w:p>
-    <w:p>
-      <w:pPr/>
-    </w:p>
-    <w:p>
-      <w:pPr/>
-    </w:p>
-    <w:p>
-      <w:pPr/>
-    </w:p>
-    <w:p>
-      <w:pPr/>
+      <w:pPr>
+        <w:spacing w:after="480"/>
+      </w:pPr>
       <w:r>
         <w:t>D</w:t>
       </w:r>
@@ -14387,57 +13924,14 @@
       </w:r>
     </w:p>
     <w:p>
-      <w:pPr/>
-    </w:p>
-    <w:p>
-      <w:pPr/>
-    </w:p>
-    <w:p>
-      <w:pPr/>
-    </w:p>
-    <w:p>
-      <w:pPr/>
-    </w:p>
-    <w:p>
-      <w:pPr/>
+      <w:pPr>
+        <w:spacing w:after="480"/>
+      </w:pPr>
       <w:r>
         <w:t>H</w:t>
       </w:r>
       <w:r>
         <w:t>andtekening van de deelnemer</w:t>
-      </w:r>
-    </w:p>
-    <w:p>
-      <w:pPr/>
-    </w:p>
-    <w:p>
-      <w:pPr/>
-    </w:p>
-    <w:p>
-      <w:pPr/>
-    </w:p>
-    <w:p>
-      <w:pPr/>
-    </w:p>
-    <w:p>
-      <w:pPr/>
-      <w:r>
-        <w:br/>
-      </w:r>
-    </w:p>
-    <w:p>
-      <w:pPr/>
-      <w:r>
-        <w:tab/>
-      </w:r>
-      <w:r>
-        <w:tab/>
-      </w:r>
-      <w:r>
-        <w:tab/>
-      </w:r>
-      <w:r>
-        <w:t xml:space="preserve"> </w:t>
       </w:r>
     </w:p>
     <w:p>
@@ -14468,76 +13962,60 @@
       </w:r>
     </w:p>
     <w:p>
+      <w:pPr>
+        <w:spacing w:after="360"/>
+      </w:pPr>
+      <w:r>
+        <w:t>Datum: …………………………...</w:t>
+      </w:r>
+    </w:p>
+    <w:p>
       <w:pPr/>
       <w:r>
-        <w:t>Datum: …………………………...</w:t>
+        <w:t xml:space="preserve">Ik </w:t>
+      </w:r>
+      <w:r>
+        <w:t xml:space="preserve">ondergetekende </w:t>
+      </w:r>
+      <w:r>
+        <w:t xml:space="preserve"> _</w:t>
+      </w:r>
+      <w:r>
+        <w:t>_______________________________</w:t>
+      </w:r>
+      <w:r>
+        <w:t xml:space="preserve">_ </w:t>
+      </w:r>
+      <w:r>
+        <w:t>,</w:t>
+      </w:r>
+      <w:r>
+        <w:t xml:space="preserve"> onderzoeker/bevoegde onderzoeksmederwerker, verklaar de benodigde informatie </w:t>
+      </w:r>
+      <w:r>
+        <w:t>inzake</w:t>
+      </w:r>
+      <w:r>
+        <w:t xml:space="preserve"> deze studie mondeling te hebben verstrekt evenals een exemplaar van het informatiedocument aan de deelnemer te hebben verstrekt. </w:t>
       </w:r>
     </w:p>
     <w:p>
       <w:pPr/>
       <w:r>
-        <w:t xml:space="preserve">    </w:t>
-      </w:r>
-      <w:r>
-        <w:t xml:space="preserve"> </w:t>
+        <w:t xml:space="preserve">Ik bevestig dat geen enkele druk op de deelnemer is uitgeoefend om hem/haar te doen toestemmen tot deelname aan de studie en ik ben bereid om op alle eventuele bijkomende vragen te antwoorden. </w:t>
       </w:r>
     </w:p>
     <w:p>
       <w:pPr/>
       <w:r>
-        <w:t xml:space="preserve"> </w:t>
-      </w:r>
-    </w:p>
-    <w:p>
-      <w:pPr/>
-      <w:r>
-        <w:t xml:space="preserve">Ik </w:t>
-      </w:r>
-      <w:r>
-        <w:t xml:space="preserve">ondergetekende </w:t>
-      </w:r>
-      <w:r>
-        <w:t xml:space="preserve"> _</w:t>
-      </w:r>
-      <w:r>
-        <w:t>_______________________________</w:t>
-      </w:r>
-      <w:r>
-        <w:t xml:space="preserve">_ </w:t>
-      </w:r>
-      <w:r>
-        <w:t>,</w:t>
-      </w:r>
-      <w:r>
-        <w:t xml:space="preserve"> onderzoeker/bevoegde onderzoeksmederwerker, verklaar de benodigde informatie </w:t>
+        <w:t xml:space="preserve">Ik bevestig dat ik werk in overeenstemming met de ethische beginselen zoals vermeld in de laatste versie van de "Verklaring van Helsinki", de "Goede klinische praktijk" en de Belgische wet van 7 mei 2004 </w:t>
       </w:r>
       <w:r>
         <w:t>inzake</w:t>
       </w:r>
       <w:r>
-        <w:t xml:space="preserve"> deze studie mondeling te hebben verstrekt evenals een exemplaar van het informatiedocument aan de deelnemer te hebben verstrekt. </w:t>
-      </w:r>
-    </w:p>
-    <w:p>
-      <w:pPr/>
-      <w:r>
-        <w:t xml:space="preserve">Ik bevestig dat geen enkele druk op de deelnemer is uitgeoefend om hem/haar te doen toestemmen tot deelname aan de studie en ik ben bereid om op alle eventuele bijkomende vragen te antwoorden. </w:t>
-      </w:r>
-    </w:p>
-    <w:p>
-      <w:pPr/>
-      <w:r>
-        <w:t xml:space="preserve">Ik bevestig dat ik werk in overeenstemming met de ethische beginselen zoals vermeld in de laatste versie van de "Verklaring van Helsinki", de "Goede klinische praktijk" en de Belgische wet van 7 mei 2004 </w:t>
-      </w:r>
-      <w:r>
-        <w:t>inzake</w:t>
-      </w:r>
-      <w:r>
         <w:t xml:space="preserve"> experimenten op de menselijke persoon. </w:t>
       </w:r>
-    </w:p>
-    <w:p>
-      <w:pPr/>
     </w:p>
     <w:tbl>
       <w:tblPr>
@@ -14574,9 +14052,10 @@
         </w:tc>
       </w:tr>
     </w:tbl>
-    <w:p/>
-    <w:p>
-      <w:pPr/>
+    <w:p>
+      <w:pPr>
+        <w:spacing w:after="240"/>
+      </w:pPr>
       <w:r>
         <w:rPr>
           <w:b/>
@@ -14597,10 +14076,9 @@
       </w:r>
     </w:p>
     <w:p>
-      <w:pPr/>
-    </w:p>
-    <w:p>
-      <w:pPr/>
+      <w:pPr>
+        <w:spacing w:after="240"/>
+      </w:pPr>
       <w:r>
         <w:rPr>
           <w:b/>
@@ -14640,195 +14118,193 @@
     </w:p>
     <w:p>
       <w:pPr/>
+      <w:r>
+        <w:t>Ik verklaar dat ik geïnformeerd ben over de aard, het doel, de duur</w:t>
+      </w:r>
+      <w:r>
+        <w:t>,</w:t>
+      </w:r>
+      <w:r>
+        <w:t xml:space="preserve"> de eventuele </w:t>
+      </w:r>
+      <w:r>
+        <w:t>voordelen</w:t>
+      </w:r>
+      <w:r>
+        <w:t xml:space="preserve"> en risico’s van de studie en dat ik weet wat van mij wordt verwacht. </w:t>
+      </w:r>
     </w:p>
     <w:p>
       <w:pPr/>
       <w:r>
-        <w:t>Ik verklaar dat ik geïnformeerd ben over de aard, het doel, de duur</w:t>
-      </w:r>
-      <w:r>
-        <w:t>,</w:t>
-      </w:r>
-      <w:r>
-        <w:t xml:space="preserve"> de eventuele </w:t>
-      </w:r>
-      <w:r>
-        <w:t>voordelen</w:t>
-      </w:r>
-      <w:r>
-        <w:t xml:space="preserve"> en risico’s van de studie en dat ik weet wat van mij wordt verwacht. </w:t>
+        <w:t>Ik heb kennisgenomen van het informatiedocument en de bijlagen ervan.</w:t>
       </w:r>
     </w:p>
     <w:p>
       <w:pPr/>
       <w:r>
-        <w:t>Ik heb kennisgenomen van het informatiedocument en de bijlagen ervan.</w:t>
+        <w:t xml:space="preserve">Ik heb voldoende tijd gehad om na te denken en met een door mij gekozen persoon, </w:t>
+      </w:r>
+      <w:r>
+        <w:t xml:space="preserve">bijvoorbeeld een personeelslid van de diabetesvoetkliniek of </w:t>
+      </w:r>
+      <w:r>
+        <w:t>collega manager</w:t>
+      </w:r>
+      <w:r>
+        <w:t>, te praten.</w:t>
       </w:r>
     </w:p>
     <w:p>
       <w:pPr/>
       <w:r>
-        <w:t xml:space="preserve">Ik heb voldoende tijd gehad om na te denken en met een door mij gekozen persoon, </w:t>
-      </w:r>
-      <w:r>
-        <w:t xml:space="preserve">bijvoorbeeld een personeelslid van de diabetesvoetkliniek of </w:t>
-      </w:r>
-      <w:r>
-        <w:t>collega manager</w:t>
-      </w:r>
-      <w:r>
-        <w:t>, te praten.</w:t>
+        <w:t>Ik heb alle vragen kunnen stellen die bij me opkwamen en ik heb een duidelijk antwoord gekregen op mijn vragen.</w:t>
       </w:r>
     </w:p>
     <w:p>
       <w:pPr/>
       <w:r>
-        <w:t>Ik heb alle vragen kunnen stellen die bij me opkwamen en ik heb een duidelijk antwoord gekregen op mijn vragen.</w:t>
+        <w:t xml:space="preserve">Ik begrijp dat mijn deelname aan deze studie vrijwillig is en dat ik vrij ben mijn deelname aan deze studie stop te zetten zonder dat dit mijn relatie schaadt met </w:t>
+      </w:r>
+      <w:r>
+        <w:t>mijn leidinggevende en/of personeelsleden van de diabetesvoetkliniek</w:t>
+      </w:r>
+      <w:r>
+        <w:t>.</w:t>
       </w:r>
     </w:p>
     <w:p>
       <w:pPr/>
       <w:r>
-        <w:t xml:space="preserve">Ik begrijp dat mijn deelname aan deze studie vrijwillig is en dat ik vrij ben mijn deelname aan deze studie stop te zetten zonder dat dit mijn relatie schaadt met </w:t>
-      </w:r>
-      <w:r>
-        <w:t>mijn leidinggevende en/of personeelsleden van de diabetesvoetkliniek</w:t>
+        <w:t xml:space="preserve">Ik begrijp dat er tijdens mijn deelname aan </w:t>
+      </w:r>
+      <w:r>
+        <w:t>deze</w:t>
+      </w:r>
+      <w:r>
+        <w:t xml:space="preserve"> studie gegevens over mij zullen worden verzameld en dat </w:t>
+      </w:r>
+      <w:r>
+        <w:t>de arts-onderzoeker en de opdrachtgever de vertrouwelijkheid van deze gegevens verzekeren overeenkomstig de Europese en Belgische</w:t>
+      </w:r>
+      <w:r>
+        <w:t xml:space="preserve"> wetgeving ter zake.</w:t>
+      </w:r>
+      <w:r>
+        <w:t xml:space="preserve"> Ik begrijp dat </w:t>
+      </w:r>
+      <w:r>
+        <w:t xml:space="preserve">het uitvoeren van deze studie door KU Leuven het algemeen belang dient en </w:t>
+      </w:r>
+      <w:r>
+        <w:t xml:space="preserve">de verwerking </w:t>
+      </w:r>
+      <w:r>
+        <w:t xml:space="preserve">van mijn persoonsgegevens noodzakelijk is </w:t>
+      </w:r>
+      <w:r>
+        <w:t xml:space="preserve">voor het uitvoeren van </w:t>
+      </w:r>
+      <w:r>
+        <w:t>deze studie.</w:t>
+      </w:r>
+      <w:r>
+        <w:t xml:space="preserve"> </w:t>
+      </w:r>
+    </w:p>
+    <w:p>
+      <w:pPr/>
+      <w:r>
+        <w:t xml:space="preserve">Ik begrijp dat deze </w:t>
+      </w:r>
+      <w:r>
+        <w:t xml:space="preserve">studie deel uitmaakt van een gezamenlijk project tussen KU Leuven, VUB en </w:t>
+      </w:r>
+      <w:r>
+        <w:t>zes diabetesvoetklinieken (</w:t>
+      </w:r>
+      <w:r>
+        <w:t>UZGent</w:t>
+      </w:r>
+      <w:r>
+        <w:t xml:space="preserve">, </w:t>
+      </w:r>
+      <w:r>
+        <w:t>UZAntwerpen</w:t>
+      </w:r>
+      <w:r>
+        <w:t xml:space="preserve">, AZ </w:t>
+      </w:r>
+      <w:r>
+        <w:t>Groeninge</w:t>
+      </w:r>
+      <w:r>
+        <w:t xml:space="preserve">, AZ Sint-Jan, </w:t>
+      </w:r>
+      <w:r>
+        <w:t>Azorg</w:t>
+      </w:r>
+      <w:r>
+        <w:t xml:space="preserve">, </w:t>
+      </w:r>
+      <w:r>
+        <w:t>UZLeuven</w:t>
+      </w:r>
+      <w:r>
+        <w:t xml:space="preserve">). De </w:t>
+      </w:r>
+      <w:r>
+        <w:t xml:space="preserve">studiegegevens </w:t>
+      </w:r>
+      <w:r>
+        <w:t xml:space="preserve">zullen </w:t>
+      </w:r>
+      <w:r>
+        <w:t>vertrouwelijk tussen de project partners gedeeld worden om het welslagen van dit project mogelijk te maken.</w:t>
+      </w:r>
+      <w:r>
+        <w:t xml:space="preserve"> </w:t>
+      </w:r>
+    </w:p>
+    <w:p>
+      <w:pPr/>
+      <w:r>
+        <w:t>Ik geef toestemming dat er in het kader van deze klinische studie een geluidsopname wordt gemaakt van het interview om later door de onderzoeker uitgeschreven te worden. Nadat het interview is uitgeschreven wordt de geluidsopname onmiddellijk verwijderd. Deze gegevens zullen enkel in groep gerapporteerd worden en nooit individueel. Deze data worden volledig vertrouwelijk behandeld.</w:t>
+      </w:r>
+    </w:p>
+    <w:p>
+      <w:pPr/>
+      <w:r>
+        <w:t>Ik geef toestemming dat de data die voortvloei</w:t>
+      </w:r>
+      <w:r>
+        <w:t>en</w:t>
+      </w:r>
+      <w:r>
+        <w:t xml:space="preserve"> uit mijn deelname aan de studie, mag gebruikt worden in andere, toekomstige, wetenschappelijke studies van de </w:t>
+      </w:r>
+      <w:r>
+        <w:t>voormelde</w:t>
+      </w:r>
+      <w:r>
+        <w:t xml:space="preserve"> project partners</w:t>
       </w:r>
       <w:r>
         <w:t>.</w:t>
       </w:r>
     </w:p>
     <w:p>
-      <w:pPr/>
-      <w:r>
-        <w:t xml:space="preserve">Ik begrijp dat er tijdens mijn deelname aan </w:t>
-      </w:r>
-      <w:r>
-        <w:t>deze</w:t>
-      </w:r>
-      <w:r>
-        <w:t xml:space="preserve"> studie gegevens over mij zullen worden verzameld en dat </w:t>
-      </w:r>
-      <w:r>
-        <w:t>de arts-onderzoeker en de opdrachtgever de vertrouwelijkheid van deze gegevens verzekeren overeenkomstig de Europese en Belgische</w:t>
-      </w:r>
-      <w:r>
-        <w:t xml:space="preserve"> wetgeving ter zake.</w:t>
-      </w:r>
-      <w:r>
-        <w:t xml:space="preserve"> Ik begrijp dat </w:t>
-      </w:r>
-      <w:r>
-        <w:t xml:space="preserve">het uitvoeren van deze studie door KU Leuven het algemeen belang dient en </w:t>
-      </w:r>
-      <w:r>
-        <w:t xml:space="preserve">de verwerking </w:t>
-      </w:r>
-      <w:r>
-        <w:t xml:space="preserve">van mijn persoonsgegevens noodzakelijk is </w:t>
-      </w:r>
-      <w:r>
-        <w:t xml:space="preserve">voor het uitvoeren van </w:t>
-      </w:r>
-      <w:r>
-        <w:t>deze studie.</w:t>
-      </w:r>
-      <w:r>
-        <w:t xml:space="preserve"> </w:t>
-      </w:r>
-    </w:p>
-    <w:p>
-      <w:pPr/>
-      <w:r>
-        <w:t xml:space="preserve">Ik begrijp dat deze </w:t>
-      </w:r>
-      <w:r>
-        <w:t xml:space="preserve">studie deel uitmaakt van een gezamenlijk project tussen KU Leuven, VUB en </w:t>
-      </w:r>
-      <w:r>
-        <w:t>zes diabetesvoetklinieken (</w:t>
-      </w:r>
-      <w:r>
-        <w:t>UZGent</w:t>
-      </w:r>
-      <w:r>
-        <w:t xml:space="preserve">, </w:t>
-      </w:r>
-      <w:r>
-        <w:t>UZAntwerpen</w:t>
-      </w:r>
-      <w:r>
-        <w:t xml:space="preserve">, AZ </w:t>
-      </w:r>
-      <w:r>
-        <w:t>Groeninge</w:t>
-      </w:r>
-      <w:r>
-        <w:t xml:space="preserve">, AZ Sint-Jan, </w:t>
-      </w:r>
-      <w:r>
-        <w:t>Azorg</w:t>
-      </w:r>
-      <w:r>
-        <w:t xml:space="preserve">, </w:t>
-      </w:r>
-      <w:r>
-        <w:t>UZLeuven</w:t>
-      </w:r>
-      <w:r>
-        <w:t xml:space="preserve">). De </w:t>
-      </w:r>
-      <w:r>
-        <w:t xml:space="preserve">studiegegevens </w:t>
-      </w:r>
-      <w:r>
-        <w:t xml:space="preserve">zullen </w:t>
-      </w:r>
-      <w:r>
-        <w:t>vertrouwelijk tussen de project partners gedeeld worden om het welslagen van dit project mogelijk te maken.</w:t>
-      </w:r>
-      <w:r>
-        <w:t xml:space="preserve"> </w:t>
-      </w:r>
-    </w:p>
-    <w:p>
-      <w:pPr/>
-      <w:r>
-        <w:t>Ik geef toestemming dat er in het kader van deze klinische studie een geluidsopname wordt gemaakt van het interview om later door de onderzoeker uitgeschreven te worden. Nadat het interview is uitgeschreven wordt de geluidsopname onmiddellijk verwijderd. Deze gegevens zullen enkel in groep gerapporteerd worden en nooit individueel. Deze data worden volledig vertrouwelijk behandeld.</w:t>
-      </w:r>
-    </w:p>
-    <w:p>
-      <w:pPr/>
-      <w:r>
-        <w:t>Ik geef toestemming dat de data die voortvloei</w:t>
-      </w:r>
-      <w:r>
-        <w:t>en</w:t>
-      </w:r>
-      <w:r>
-        <w:t xml:space="preserve"> uit mijn deelname aan de studie, mag gebruikt worden in andere, toekomstige, wetenschappelijke studies van de </w:t>
-      </w:r>
-      <w:r>
-        <w:t>voormelde</w:t>
-      </w:r>
-      <w:r>
-        <w:t xml:space="preserve"> project partners</w:t>
-      </w:r>
-      <w:r>
-        <w:t>.</w:t>
-      </w:r>
-    </w:p>
-    <w:p>
-      <w:pPr/>
+      <w:pPr>
+        <w:spacing w:after="240"/>
+      </w:pPr>
       <w:r>
         <w:t>Ik heb een exemplaar ontvangen van de informatie aan de deelnemer en de geïnformeerde toestemming.</w:t>
       </w:r>
     </w:p>
     <w:p>
-      <w:pPr/>
-    </w:p>
-    <w:p>
-      <w:pPr/>
+      <w:pPr>
+        <w:spacing w:after="480"/>
+      </w:pPr>
       <w:r>
         <w:t>Naam</w:t>
       </w:r>
@@ -14846,19 +14322,9 @@
       </w:r>
     </w:p>
     <w:p>
-      <w:pPr/>
-    </w:p>
-    <w:p>
-      <w:pPr/>
-    </w:p>
-    <w:p>
-      <w:pPr/>
-    </w:p>
-    <w:p>
-      <w:pPr/>
-    </w:p>
-    <w:p>
-      <w:pPr/>
+      <w:pPr>
+        <w:spacing w:after="480"/>
+      </w:pPr>
       <w:r>
         <w:t>D</w:t>
       </w:r>
@@ -14870,57 +14336,14 @@
       </w:r>
     </w:p>
     <w:p>
-      <w:pPr/>
-    </w:p>
-    <w:p>
-      <w:pPr/>
-    </w:p>
-    <w:p>
-      <w:pPr/>
-    </w:p>
-    <w:p>
-      <w:pPr/>
-    </w:p>
-    <w:p>
-      <w:pPr/>
+      <w:pPr>
+        <w:spacing w:after="480"/>
+      </w:pPr>
       <w:r>
         <w:t>H</w:t>
       </w:r>
       <w:r>
         <w:t>andtekening van de deelnemer</w:t>
-      </w:r>
-    </w:p>
-    <w:p>
-      <w:pPr/>
-    </w:p>
-    <w:p>
-      <w:pPr/>
-    </w:p>
-    <w:p>
-      <w:pPr/>
-    </w:p>
-    <w:p>
-      <w:pPr/>
-    </w:p>
-    <w:p>
-      <w:pPr/>
-      <w:r>
-        <w:br/>
-      </w:r>
-    </w:p>
-    <w:p>
-      <w:pPr/>
-      <w:r>
-        <w:tab/>
-      </w:r>
-      <w:r>
-        <w:tab/>
-      </w:r>
-      <w:r>
-        <w:tab/>
-      </w:r>
-      <w:r>
-        <w:t xml:space="preserve"> </w:t>
       </w:r>
     </w:p>
     <w:p>
@@ -14945,70 +14368,54 @@
       </w:r>
     </w:p>
     <w:p>
+      <w:pPr>
+        <w:spacing w:after="360"/>
+      </w:pPr>
+      <w:r>
+        <w:t>Datum: …………………………...</w:t>
+      </w:r>
+    </w:p>
+    <w:p>
       <w:pPr/>
       <w:r>
-        <w:t>Datum: …………………………...</w:t>
+        <w:t xml:space="preserve">Ik </w:t>
+      </w:r>
+      <w:r>
+        <w:t>ondergetekende  _</w:t>
+      </w:r>
+      <w:r>
+        <w:t>_______________________________</w:t>
+      </w:r>
+      <w:r>
+        <w:t>_ ,</w:t>
+      </w:r>
+      <w:r>
+        <w:t xml:space="preserve"> onderzoeker/bevoegde onderzoeksmederwerker, verklaar de benodigde informatie </w:t>
+      </w:r>
+      <w:r>
+        <w:t>inzake</w:t>
+      </w:r>
+      <w:r>
+        <w:t xml:space="preserve"> deze studie mondeling te hebben verstrekt evenals een exemplaar van het informatiedocument aan de deelnemer te hebben verstrekt. </w:t>
       </w:r>
     </w:p>
     <w:p>
       <w:pPr/>
       <w:r>
-        <w:t xml:space="preserve">    </w:t>
-      </w:r>
-      <w:r>
-        <w:t xml:space="preserve"> </w:t>
+        <w:t xml:space="preserve">Ik bevestig dat geen enkele druk op de deelnemer is uitgeoefend om hem/haar te doen toestemmen tot deelname aan de studie en ik ben bereid om op alle eventuele bijkomende vragen te antwoorden. </w:t>
       </w:r>
     </w:p>
     <w:p>
       <w:pPr/>
       <w:r>
-        <w:t xml:space="preserve"> </w:t>
-      </w:r>
-    </w:p>
-    <w:p>
-      <w:pPr/>
-      <w:r>
-        <w:t xml:space="preserve">Ik </w:t>
-      </w:r>
-      <w:r>
-        <w:t>ondergetekende  _</w:t>
-      </w:r>
-      <w:r>
-        <w:t>_______________________________</w:t>
-      </w:r>
-      <w:r>
-        <w:t>_ ,</w:t>
-      </w:r>
-      <w:r>
-        <w:t xml:space="preserve"> onderzoeker/bevoegde onderzoeksmederwerker, verklaar de benodigde informatie </w:t>
+        <w:t xml:space="preserve">Ik bevestig dat ik werk in overeenstemming met de ethische beginselen zoals vermeld in de laatste versie van de "Verklaring van Helsinki", de "Goede klinische praktijk" en de Belgische wet van 7 mei 2004 </w:t>
       </w:r>
       <w:r>
         <w:t>inzake</w:t>
       </w:r>
       <w:r>
-        <w:t xml:space="preserve"> deze studie mondeling te hebben verstrekt evenals een exemplaar van het informatiedocument aan de deelnemer te hebben verstrekt. </w:t>
-      </w:r>
-    </w:p>
-    <w:p>
-      <w:pPr/>
-      <w:r>
-        <w:t xml:space="preserve">Ik bevestig dat geen enkele druk op de deelnemer is uitgeoefend om hem/haar te doen toestemmen tot deelname aan de studie en ik ben bereid om op alle eventuele bijkomende vragen te antwoorden. </w:t>
-      </w:r>
-    </w:p>
-    <w:p>
-      <w:pPr/>
-      <w:r>
-        <w:t xml:space="preserve">Ik bevestig dat ik werk in overeenstemming met de ethische beginselen zoals vermeld in de laatste versie van de "Verklaring van Helsinki", de "Goede klinische praktijk" en de Belgische wet van 7 mei 2004 </w:t>
-      </w:r>
-      <w:r>
-        <w:t>inzake</w:t>
-      </w:r>
-      <w:r>
         <w:t xml:space="preserve"> experimenten op de menselijke persoon. </w:t>
       </w:r>
-    </w:p>
-    <w:p>
-      <w:pPr/>
     </w:p>
     <w:tbl>
       <w:tblPr>
@@ -15045,35 +14452,6 @@
         </w:tc>
       </w:tr>
     </w:tbl>
-    <w:p/>
-    <w:p>
-      <w:pPr/>
-    </w:p>
-    <w:p>
-      <w:pPr/>
-    </w:p>
-    <w:p>
-      <w:pPr/>
-    </w:p>
-    <w:p>
-      <w:pPr/>
-    </w:p>
-    <w:p>
-      <w:pPr/>
-    </w:p>
-    <w:p>
-      <w:pPr/>
-    </w:p>
-    <w:p>
-      <w:pPr/>
-      <w:r>
-        <w:rPr>
-          <w:b/>
-          <w:u w:val="single"/>
-        </w:rPr>
-        <w:br/>
-      </w:r>
-    </w:p>
     <w:p>
       <w:pPr/>
       <w:r>
@@ -15550,26 +14928,25 @@
       </w:r>
     </w:p>
     <w:p>
+      <w:pPr>
+        <w:spacing w:after="240"/>
+      </w:pPr>
+      <w:r>
+        <w:t>Indien</w:t>
+      </w:r>
+      <w:r>
+        <w:t xml:space="preserve"> u uw toestemming tot deelname aan de studie intrekt, zullen de gecodeerde gegevens die al verzameld waren vóór uw terugtrekking, bewaard worden. </w:t>
+      </w:r>
+      <w:r>
+        <w:t xml:space="preserve">Hierdoor wordt de geldigheid van de studie gegarandeerd. Er zal geen enkel nieuw gegeven aan de opdrachtgever worden doorgegeven. </w:t>
+      </w:r>
+    </w:p>
+    <w:p>
       <w:pPr/>
       <w:r>
         <w:t>Indien</w:t>
       </w:r>
       <w:r>
-        <w:t xml:space="preserve"> u uw toestemming tot deelname aan de studie intrekt, zullen de gecodeerde gegevens die al verzameld waren vóór uw terugtrekking, bewaard worden. </w:t>
-      </w:r>
-      <w:r>
-        <w:t xml:space="preserve">Hierdoor wordt de geldigheid van de studie gegarandeerd. Er zal geen enkel nieuw gegeven aan de opdrachtgever worden doorgegeven. </w:t>
-      </w:r>
-    </w:p>
-    <w:p>
-      <w:pPr/>
-    </w:p>
-    <w:p>
-      <w:pPr/>
-      <w:r>
-        <w:t>Indien</w:t>
-      </w:r>
-      <w:r>
         <w:t xml:space="preserve"> u vragen hebt over hoe wij uw gegevens gebruiken, dan kan u hiervoor steeds terecht bij uw arts-onderzoeker. Ook de functionaris voor gegevensbescherming van het onderzoekcentrum staan </w:t>
       </w:r>
       <w:r>
@@ -15580,7 +14957,9 @@
       </w:r>
     </w:p>
     <w:p>
-      <w:pPr/>
+      <w:pPr>
+        <w:spacing w:after="240"/>
+      </w:pPr>
       <w:r>
         <w:t>De contactgegevens van deze laatste zijn als volgt</w:t>
       </w:r>
@@ -15604,10 +14983,9 @@
       </w:r>
     </w:p>
     <w:p>
-      <w:pPr/>
-    </w:p>
-    <w:p>
-      <w:pPr/>
+      <w:pPr>
+        <w:spacing w:after="240"/>
+      </w:pPr>
       <w:r>
         <w:t xml:space="preserve">Tot slot, </w:t>
       </w:r>
@@ -15617,9 +14995,6 @@
       <w:r>
         <w:t xml:space="preserve"> u een klacht heeft over de verwerking van uw gegevens, kunt u contact opnemen met de Belgische toezichthoudende instantie die toeziet op de naleving van de grondbeginselen van de bescherming van persoonsgegevens:</w:t>
       </w:r>
-    </w:p>
-    <w:p>
-      <w:pPr/>
     </w:p>
     <w:p>
       <w:pPr/>
@@ -15874,14 +15249,6 @@
       <w:r>
         <w:t>.</w:t>
       </w:r>
-    </w:p>
-    <w:p>
-      <w:pPr>
-        <w:pStyle w:val="Heading3"/>
-      </w:pPr>
-    </w:p>
-    <w:p>
-      <w:pPr/>
     </w:p>
     <w:sectPr>
       <w:pgSz w:w="12240" w:h="15840"/>
@@ -16256,6 +15623,9 @@
     <w:name w:val="Normal"/>
     <w:qFormat/>
     <w:rsid w:val="00FC693F"/>
+    <w:pPr>
+      <w:spacing w:after="120"/>
+    </w:pPr>
     <w:rPr>
       <w:rFonts w:ascii="Calibri" w:hAnsi="Calibri"/>
       <w:sz w:val="19"/>

</xml_diff>